<commit_message>
timeline docx: render gantt charts as real tables (code fences were garbling in Word)
</commit_message>
<xml_diff>
--- a/docs/stakeholder-package/Timeline.docx
+++ b/docs/stakeholder-package/Timeline.docx
@@ -48,42 +48,6 @@
     </w:p>
     <w:p>
       <w:pPr>
-        <w:pBdr>
-          <w:left w:val="single" w:color="B91C1C" w:sz="12"/>
-        </w:pBdr>
-        <w:spacing w:after="80" w:before="80"/>
-        <w:ind w:left="400"/>
-      </w:pPr>
-      <w:r>
-        <w:rPr>
-          <w:i/>
-          <w:iCs/>
-          <w:color w:val="555555"/>
-        </w:rPr>
-        <w:t xml:space="preserve">Markdown mirror of </w:t>
-      </w:r>
-      <w:r>
-        <w:rPr>
-          <w:rFonts w:ascii="Consolas" w:cs="Consolas" w:eastAsia="Consolas" w:hAnsi="Consolas"/>
-          <w:i/>
-          <w:iCs/>
-          <w:color w:val="555555"/>
-          <w:sz w:val="19"/>
-          <w:szCs w:val="19"/>
-        </w:rPr>
-        <w:t xml:space="preserve">03_Timeline.docx</w:t>
-      </w:r>
-      <w:r>
-        <w:rPr>
-          <w:i/>
-          <w:iCs/>
-          <w:color w:val="555555"/>
-        </w:rPr>
-        <w:t xml:space="preserve"> for Claude Code consumption.</w:t>
-      </w:r>
-    </w:p>
-    <w:p>
-      <w:pPr>
         <w:pStyle w:val="Heading2"/>
         <w:spacing w:after="120" w:before="240"/>
       </w:pPr>
@@ -160,24 +124,1915 @@
         <w:t xml:space="preserve">Week 1 starts Mon 4 May 2026; Week 12 finishes Sun 26 July 2026.</w:t>
       </w:r>
     </w:p>
+    <w:tbl>
+      <w:tblPr>
+        <w:tblW w:type="dxa" w:w="9746"/>
+        <w:tblBorders>
+          <w:top w:val="single" w:color="C9C9C9" w:sz="4"/>
+          <w:left w:val="single" w:color="C9C9C9" w:sz="4"/>
+          <w:bottom w:val="single" w:color="C9C9C9" w:sz="4"/>
+          <w:right w:val="single" w:color="C9C9C9" w:sz="4"/>
+          <w:insideH w:val="single" w:color="C9C9C9" w:sz="4"/>
+          <w:insideV w:val="single" w:color="C9C9C9" w:sz="4"/>
+        </w:tblBorders>
+      </w:tblPr>
+      <w:tblGrid>
+        <w:gridCol w:w="3314"/>
+        <w:gridCol w:w="536"/>
+        <w:gridCol w:w="536"/>
+        <w:gridCol w:w="536"/>
+        <w:gridCol w:w="536"/>
+        <w:gridCol w:w="536"/>
+        <w:gridCol w:w="536"/>
+        <w:gridCol w:w="536"/>
+        <w:gridCol w:w="536"/>
+        <w:gridCol w:w="536"/>
+        <w:gridCol w:w="536"/>
+        <w:gridCol w:w="536"/>
+        <w:gridCol w:w="536"/>
+      </w:tblGrid>
+      <w:tr>
+        <w:trPr>
+          <w:tblHeader/>
+        </w:trPr>
+        <w:tc>
+          <w:tcPr>
+            <w:tcW w:type="dxa" w:w="3314"/>
+            <w:shd w:fill="EFEFEF" w:val="clear"/>
+            <w:tcMar>
+              <w:top w:type="dxa" w:w="60"/>
+              <w:left w:type="dxa" w:w="100"/>
+              <w:bottom w:type="dxa" w:w="60"/>
+              <w:right w:type="dxa" w:w="100"/>
+            </w:tcMar>
+          </w:tcPr>
+          <w:p>
+            <w:pPr>
+              <w:spacing w:after="20" w:before="20"/>
+            </w:pPr>
+            <w:r>
+              <w:rPr>
+                <w:b/>
+                <w:bCs/>
+              </w:rPr>
+              <w:t xml:space="preserve">Phase</w:t>
+            </w:r>
+          </w:p>
+        </w:tc>
+        <w:tc>
+          <w:tcPr>
+            <w:tcW w:type="dxa" w:w="536"/>
+            <w:shd w:fill="EFEFEF" w:val="clear"/>
+            <w:tcMar>
+              <w:top w:type="dxa" w:w="60"/>
+              <w:left w:type="dxa" w:w="100"/>
+              <w:bottom w:type="dxa" w:w="60"/>
+              <w:right w:type="dxa" w:w="100"/>
+            </w:tcMar>
+          </w:tcPr>
+          <w:p>
+            <w:pPr>
+              <w:spacing w:after="20" w:before="20"/>
+            </w:pPr>
+            <w:r>
+              <w:rPr>
+                <w:b/>
+                <w:bCs/>
+              </w:rPr>
+              <w:t xml:space="preserve">W1</w:t>
+            </w:r>
+          </w:p>
+        </w:tc>
+        <w:tc>
+          <w:tcPr>
+            <w:tcW w:type="dxa" w:w="536"/>
+            <w:shd w:fill="EFEFEF" w:val="clear"/>
+            <w:tcMar>
+              <w:top w:type="dxa" w:w="60"/>
+              <w:left w:type="dxa" w:w="100"/>
+              <w:bottom w:type="dxa" w:w="60"/>
+              <w:right w:type="dxa" w:w="100"/>
+            </w:tcMar>
+          </w:tcPr>
+          <w:p>
+            <w:pPr>
+              <w:spacing w:after="20" w:before="20"/>
+            </w:pPr>
+            <w:r>
+              <w:rPr>
+                <w:b/>
+                <w:bCs/>
+              </w:rPr>
+              <w:t xml:space="preserve">W2</w:t>
+            </w:r>
+          </w:p>
+        </w:tc>
+        <w:tc>
+          <w:tcPr>
+            <w:tcW w:type="dxa" w:w="536"/>
+            <w:shd w:fill="EFEFEF" w:val="clear"/>
+            <w:tcMar>
+              <w:top w:type="dxa" w:w="60"/>
+              <w:left w:type="dxa" w:w="100"/>
+              <w:bottom w:type="dxa" w:w="60"/>
+              <w:right w:type="dxa" w:w="100"/>
+            </w:tcMar>
+          </w:tcPr>
+          <w:p>
+            <w:pPr>
+              <w:spacing w:after="20" w:before="20"/>
+            </w:pPr>
+            <w:r>
+              <w:rPr>
+                <w:b/>
+                <w:bCs/>
+              </w:rPr>
+              <w:t xml:space="preserve">W3</w:t>
+            </w:r>
+          </w:p>
+        </w:tc>
+        <w:tc>
+          <w:tcPr>
+            <w:tcW w:type="dxa" w:w="536"/>
+            <w:shd w:fill="EFEFEF" w:val="clear"/>
+            <w:tcMar>
+              <w:top w:type="dxa" w:w="60"/>
+              <w:left w:type="dxa" w:w="100"/>
+              <w:bottom w:type="dxa" w:w="60"/>
+              <w:right w:type="dxa" w:w="100"/>
+            </w:tcMar>
+          </w:tcPr>
+          <w:p>
+            <w:pPr>
+              <w:spacing w:after="20" w:before="20"/>
+            </w:pPr>
+            <w:r>
+              <w:rPr>
+                <w:b/>
+                <w:bCs/>
+              </w:rPr>
+              <w:t xml:space="preserve">W4</w:t>
+            </w:r>
+          </w:p>
+        </w:tc>
+        <w:tc>
+          <w:tcPr>
+            <w:tcW w:type="dxa" w:w="536"/>
+            <w:shd w:fill="EFEFEF" w:val="clear"/>
+            <w:tcMar>
+              <w:top w:type="dxa" w:w="60"/>
+              <w:left w:type="dxa" w:w="100"/>
+              <w:bottom w:type="dxa" w:w="60"/>
+              <w:right w:type="dxa" w:w="100"/>
+            </w:tcMar>
+          </w:tcPr>
+          <w:p>
+            <w:pPr>
+              <w:spacing w:after="20" w:before="20"/>
+            </w:pPr>
+            <w:r>
+              <w:rPr>
+                <w:b/>
+                <w:bCs/>
+              </w:rPr>
+              <w:t xml:space="preserve">W5</w:t>
+            </w:r>
+          </w:p>
+        </w:tc>
+        <w:tc>
+          <w:tcPr>
+            <w:tcW w:type="dxa" w:w="536"/>
+            <w:shd w:fill="EFEFEF" w:val="clear"/>
+            <w:tcMar>
+              <w:top w:type="dxa" w:w="60"/>
+              <w:left w:type="dxa" w:w="100"/>
+              <w:bottom w:type="dxa" w:w="60"/>
+              <w:right w:type="dxa" w:w="100"/>
+            </w:tcMar>
+          </w:tcPr>
+          <w:p>
+            <w:pPr>
+              <w:spacing w:after="20" w:before="20"/>
+            </w:pPr>
+            <w:r>
+              <w:rPr>
+                <w:b/>
+                <w:bCs/>
+              </w:rPr>
+              <w:t xml:space="preserve">W6</w:t>
+            </w:r>
+          </w:p>
+        </w:tc>
+        <w:tc>
+          <w:tcPr>
+            <w:tcW w:type="dxa" w:w="536"/>
+            <w:shd w:fill="EFEFEF" w:val="clear"/>
+            <w:tcMar>
+              <w:top w:type="dxa" w:w="60"/>
+              <w:left w:type="dxa" w:w="100"/>
+              <w:bottom w:type="dxa" w:w="60"/>
+              <w:right w:type="dxa" w:w="100"/>
+            </w:tcMar>
+          </w:tcPr>
+          <w:p>
+            <w:pPr>
+              <w:spacing w:after="20" w:before="20"/>
+            </w:pPr>
+            <w:r>
+              <w:rPr>
+                <w:b/>
+                <w:bCs/>
+              </w:rPr>
+              <w:t xml:space="preserve">W7</w:t>
+            </w:r>
+          </w:p>
+        </w:tc>
+        <w:tc>
+          <w:tcPr>
+            <w:tcW w:type="dxa" w:w="536"/>
+            <w:shd w:fill="EFEFEF" w:val="clear"/>
+            <w:tcMar>
+              <w:top w:type="dxa" w:w="60"/>
+              <w:left w:type="dxa" w:w="100"/>
+              <w:bottom w:type="dxa" w:w="60"/>
+              <w:right w:type="dxa" w:w="100"/>
+            </w:tcMar>
+          </w:tcPr>
+          <w:p>
+            <w:pPr>
+              <w:spacing w:after="20" w:before="20"/>
+            </w:pPr>
+            <w:r>
+              <w:rPr>
+                <w:b/>
+                <w:bCs/>
+              </w:rPr>
+              <w:t xml:space="preserve">W8</w:t>
+            </w:r>
+          </w:p>
+        </w:tc>
+        <w:tc>
+          <w:tcPr>
+            <w:tcW w:type="dxa" w:w="536"/>
+            <w:shd w:fill="EFEFEF" w:val="clear"/>
+            <w:tcMar>
+              <w:top w:type="dxa" w:w="60"/>
+              <w:left w:type="dxa" w:w="100"/>
+              <w:bottom w:type="dxa" w:w="60"/>
+              <w:right w:type="dxa" w:w="100"/>
+            </w:tcMar>
+          </w:tcPr>
+          <w:p>
+            <w:pPr>
+              <w:spacing w:after="20" w:before="20"/>
+            </w:pPr>
+            <w:r>
+              <w:rPr>
+                <w:b/>
+                <w:bCs/>
+              </w:rPr>
+              <w:t xml:space="preserve">W9</w:t>
+            </w:r>
+          </w:p>
+        </w:tc>
+        <w:tc>
+          <w:tcPr>
+            <w:tcW w:type="dxa" w:w="536"/>
+            <w:shd w:fill="EFEFEF" w:val="clear"/>
+            <w:tcMar>
+              <w:top w:type="dxa" w:w="60"/>
+              <w:left w:type="dxa" w:w="100"/>
+              <w:bottom w:type="dxa" w:w="60"/>
+              <w:right w:type="dxa" w:w="100"/>
+            </w:tcMar>
+          </w:tcPr>
+          <w:p>
+            <w:pPr>
+              <w:spacing w:after="20" w:before="20"/>
+            </w:pPr>
+            <w:r>
+              <w:rPr>
+                <w:b/>
+                <w:bCs/>
+              </w:rPr>
+              <w:t xml:space="preserve">W10</w:t>
+            </w:r>
+          </w:p>
+        </w:tc>
+        <w:tc>
+          <w:tcPr>
+            <w:tcW w:type="dxa" w:w="536"/>
+            <w:shd w:fill="EFEFEF" w:val="clear"/>
+            <w:tcMar>
+              <w:top w:type="dxa" w:w="60"/>
+              <w:left w:type="dxa" w:w="100"/>
+              <w:bottom w:type="dxa" w:w="60"/>
+              <w:right w:type="dxa" w:w="100"/>
+            </w:tcMar>
+          </w:tcPr>
+          <w:p>
+            <w:pPr>
+              <w:spacing w:after="20" w:before="20"/>
+            </w:pPr>
+            <w:r>
+              <w:rPr>
+                <w:b/>
+                <w:bCs/>
+              </w:rPr>
+              <w:t xml:space="preserve">W11</w:t>
+            </w:r>
+          </w:p>
+        </w:tc>
+        <w:tc>
+          <w:tcPr>
+            <w:tcW w:type="dxa" w:w="536"/>
+            <w:shd w:fill="EFEFEF" w:val="clear"/>
+            <w:tcMar>
+              <w:top w:type="dxa" w:w="60"/>
+              <w:left w:type="dxa" w:w="100"/>
+              <w:bottom w:type="dxa" w:w="60"/>
+              <w:right w:type="dxa" w:w="100"/>
+            </w:tcMar>
+          </w:tcPr>
+          <w:p>
+            <w:pPr>
+              <w:spacing w:after="20" w:before="20"/>
+            </w:pPr>
+            <w:r>
+              <w:rPr>
+                <w:b/>
+                <w:bCs/>
+              </w:rPr>
+              <w:t xml:space="preserve">W12</w:t>
+            </w:r>
+          </w:p>
+        </w:tc>
+      </w:tr>
+      <w:tr>
+        <w:trPr>
+          <w:tblHeader w:val="false"/>
+        </w:trPr>
+        <w:tc>
+          <w:tcPr>
+            <w:tcW w:type="dxa" w:w="3314"/>
+            <w:tcMar>
+              <w:top w:type="dxa" w:w="60"/>
+              <w:left w:type="dxa" w:w="100"/>
+              <w:bottom w:type="dxa" w:w="60"/>
+              <w:right w:type="dxa" w:w="100"/>
+            </w:tcMar>
+          </w:tcPr>
+          <w:p>
+            <w:pPr>
+              <w:spacing w:after="20" w:before="20"/>
+            </w:pPr>
+            <w:r>
+              <w:t xml:space="preserve">0 — Discovery &amp; Setup</w:t>
+            </w:r>
+          </w:p>
+        </w:tc>
+        <w:tc>
+          <w:tcPr>
+            <w:tcW w:type="dxa" w:w="536"/>
+            <w:tcMar>
+              <w:top w:type="dxa" w:w="60"/>
+              <w:left w:type="dxa" w:w="100"/>
+              <w:bottom w:type="dxa" w:w="60"/>
+              <w:right w:type="dxa" w:w="100"/>
+            </w:tcMar>
+          </w:tcPr>
+          <w:p>
+            <w:pPr>
+              <w:spacing w:after="20" w:before="20"/>
+            </w:pPr>
+            <w:r>
+              <w:t xml:space="preserve">██</w:t>
+            </w:r>
+          </w:p>
+        </w:tc>
+        <w:tc>
+          <w:tcPr>
+            <w:tcW w:type="dxa" w:w="536"/>
+            <w:tcMar>
+              <w:top w:type="dxa" w:w="60"/>
+              <w:left w:type="dxa" w:w="100"/>
+              <w:bottom w:type="dxa" w:w="60"/>
+              <w:right w:type="dxa" w:w="100"/>
+            </w:tcMar>
+          </w:tcPr>
+          <w:p>
+            <w:pPr>
+              <w:spacing w:after="20" w:before="20"/>
+            </w:pPr>
+          </w:p>
+        </w:tc>
+        <w:tc>
+          <w:tcPr>
+            <w:tcW w:type="dxa" w:w="536"/>
+            <w:tcMar>
+              <w:top w:type="dxa" w:w="60"/>
+              <w:left w:type="dxa" w:w="100"/>
+              <w:bottom w:type="dxa" w:w="60"/>
+              <w:right w:type="dxa" w:w="100"/>
+            </w:tcMar>
+          </w:tcPr>
+          <w:p>
+            <w:pPr>
+              <w:spacing w:after="20" w:before="20"/>
+            </w:pPr>
+          </w:p>
+        </w:tc>
+        <w:tc>
+          <w:tcPr>
+            <w:tcW w:type="dxa" w:w="536"/>
+            <w:tcMar>
+              <w:top w:type="dxa" w:w="60"/>
+              <w:left w:type="dxa" w:w="100"/>
+              <w:bottom w:type="dxa" w:w="60"/>
+              <w:right w:type="dxa" w:w="100"/>
+            </w:tcMar>
+          </w:tcPr>
+          <w:p>
+            <w:pPr>
+              <w:spacing w:after="20" w:before="20"/>
+            </w:pPr>
+          </w:p>
+        </w:tc>
+        <w:tc>
+          <w:tcPr>
+            <w:tcW w:type="dxa" w:w="536"/>
+            <w:tcMar>
+              <w:top w:type="dxa" w:w="60"/>
+              <w:left w:type="dxa" w:w="100"/>
+              <w:bottom w:type="dxa" w:w="60"/>
+              <w:right w:type="dxa" w:w="100"/>
+            </w:tcMar>
+          </w:tcPr>
+          <w:p>
+            <w:pPr>
+              <w:spacing w:after="20" w:before="20"/>
+            </w:pPr>
+          </w:p>
+        </w:tc>
+        <w:tc>
+          <w:tcPr>
+            <w:tcW w:type="dxa" w:w="536"/>
+            <w:tcMar>
+              <w:top w:type="dxa" w:w="60"/>
+              <w:left w:type="dxa" w:w="100"/>
+              <w:bottom w:type="dxa" w:w="60"/>
+              <w:right w:type="dxa" w:w="100"/>
+            </w:tcMar>
+          </w:tcPr>
+          <w:p>
+            <w:pPr>
+              <w:spacing w:after="20" w:before="20"/>
+            </w:pPr>
+          </w:p>
+        </w:tc>
+        <w:tc>
+          <w:tcPr>
+            <w:tcW w:type="dxa" w:w="536"/>
+            <w:tcMar>
+              <w:top w:type="dxa" w:w="60"/>
+              <w:left w:type="dxa" w:w="100"/>
+              <w:bottom w:type="dxa" w:w="60"/>
+              <w:right w:type="dxa" w:w="100"/>
+            </w:tcMar>
+          </w:tcPr>
+          <w:p>
+            <w:pPr>
+              <w:spacing w:after="20" w:before="20"/>
+            </w:pPr>
+          </w:p>
+        </w:tc>
+        <w:tc>
+          <w:tcPr>
+            <w:tcW w:type="dxa" w:w="536"/>
+            <w:tcMar>
+              <w:top w:type="dxa" w:w="60"/>
+              <w:left w:type="dxa" w:w="100"/>
+              <w:bottom w:type="dxa" w:w="60"/>
+              <w:right w:type="dxa" w:w="100"/>
+            </w:tcMar>
+          </w:tcPr>
+          <w:p>
+            <w:pPr>
+              <w:spacing w:after="20" w:before="20"/>
+            </w:pPr>
+          </w:p>
+        </w:tc>
+        <w:tc>
+          <w:tcPr>
+            <w:tcW w:type="dxa" w:w="536"/>
+            <w:tcMar>
+              <w:top w:type="dxa" w:w="60"/>
+              <w:left w:type="dxa" w:w="100"/>
+              <w:bottom w:type="dxa" w:w="60"/>
+              <w:right w:type="dxa" w:w="100"/>
+            </w:tcMar>
+          </w:tcPr>
+          <w:p>
+            <w:pPr>
+              <w:spacing w:after="20" w:before="20"/>
+            </w:pPr>
+          </w:p>
+        </w:tc>
+        <w:tc>
+          <w:tcPr>
+            <w:tcW w:type="dxa" w:w="536"/>
+            <w:tcMar>
+              <w:top w:type="dxa" w:w="60"/>
+              <w:left w:type="dxa" w:w="100"/>
+              <w:bottom w:type="dxa" w:w="60"/>
+              <w:right w:type="dxa" w:w="100"/>
+            </w:tcMar>
+          </w:tcPr>
+          <w:p>
+            <w:pPr>
+              <w:spacing w:after="20" w:before="20"/>
+            </w:pPr>
+          </w:p>
+        </w:tc>
+        <w:tc>
+          <w:tcPr>
+            <w:tcW w:type="dxa" w:w="536"/>
+            <w:tcMar>
+              <w:top w:type="dxa" w:w="60"/>
+              <w:left w:type="dxa" w:w="100"/>
+              <w:bottom w:type="dxa" w:w="60"/>
+              <w:right w:type="dxa" w:w="100"/>
+            </w:tcMar>
+          </w:tcPr>
+          <w:p>
+            <w:pPr>
+              <w:spacing w:after="20" w:before="20"/>
+            </w:pPr>
+          </w:p>
+        </w:tc>
+        <w:tc>
+          <w:tcPr>
+            <w:tcW w:type="dxa" w:w="536"/>
+            <w:tcMar>
+              <w:top w:type="dxa" w:w="60"/>
+              <w:left w:type="dxa" w:w="100"/>
+              <w:bottom w:type="dxa" w:w="60"/>
+              <w:right w:type="dxa" w:w="100"/>
+            </w:tcMar>
+          </w:tcPr>
+          <w:p>
+            <w:pPr>
+              <w:spacing w:after="20" w:before="20"/>
+            </w:pPr>
+          </w:p>
+        </w:tc>
+      </w:tr>
+      <w:tr>
+        <w:trPr>
+          <w:tblHeader w:val="false"/>
+        </w:trPr>
+        <w:tc>
+          <w:tcPr>
+            <w:tcW w:type="dxa" w:w="3314"/>
+            <w:tcMar>
+              <w:top w:type="dxa" w:w="60"/>
+              <w:left w:type="dxa" w:w="100"/>
+              <w:bottom w:type="dxa" w:w="60"/>
+              <w:right w:type="dxa" w:w="100"/>
+            </w:tcMar>
+          </w:tcPr>
+          <w:p>
+            <w:pPr>
+              <w:spacing w:after="20" w:before="20"/>
+            </w:pPr>
+            <w:r>
+              <w:t xml:space="preserve">1 — Foundations</w:t>
+            </w:r>
+          </w:p>
+        </w:tc>
+        <w:tc>
+          <w:tcPr>
+            <w:tcW w:type="dxa" w:w="536"/>
+            <w:tcMar>
+              <w:top w:type="dxa" w:w="60"/>
+              <w:left w:type="dxa" w:w="100"/>
+              <w:bottom w:type="dxa" w:w="60"/>
+              <w:right w:type="dxa" w:w="100"/>
+            </w:tcMar>
+          </w:tcPr>
+          <w:p>
+            <w:pPr>
+              <w:spacing w:after="20" w:before="20"/>
+            </w:pPr>
+          </w:p>
+        </w:tc>
+        <w:tc>
+          <w:tcPr>
+            <w:tcW w:type="dxa" w:w="536"/>
+            <w:tcMar>
+              <w:top w:type="dxa" w:w="60"/>
+              <w:left w:type="dxa" w:w="100"/>
+              <w:bottom w:type="dxa" w:w="60"/>
+              <w:right w:type="dxa" w:w="100"/>
+            </w:tcMar>
+          </w:tcPr>
+          <w:p>
+            <w:pPr>
+              <w:spacing w:after="20" w:before="20"/>
+            </w:pPr>
+            <w:r>
+              <w:t xml:space="preserve">██</w:t>
+            </w:r>
+          </w:p>
+        </w:tc>
+        <w:tc>
+          <w:tcPr>
+            <w:tcW w:type="dxa" w:w="536"/>
+            <w:tcMar>
+              <w:top w:type="dxa" w:w="60"/>
+              <w:left w:type="dxa" w:w="100"/>
+              <w:bottom w:type="dxa" w:w="60"/>
+              <w:right w:type="dxa" w:w="100"/>
+            </w:tcMar>
+          </w:tcPr>
+          <w:p>
+            <w:pPr>
+              <w:spacing w:after="20" w:before="20"/>
+            </w:pPr>
+            <w:r>
+              <w:t xml:space="preserve">██</w:t>
+            </w:r>
+          </w:p>
+        </w:tc>
+        <w:tc>
+          <w:tcPr>
+            <w:tcW w:type="dxa" w:w="536"/>
+            <w:tcMar>
+              <w:top w:type="dxa" w:w="60"/>
+              <w:left w:type="dxa" w:w="100"/>
+              <w:bottom w:type="dxa" w:w="60"/>
+              <w:right w:type="dxa" w:w="100"/>
+            </w:tcMar>
+          </w:tcPr>
+          <w:p>
+            <w:pPr>
+              <w:spacing w:after="20" w:before="20"/>
+            </w:pPr>
+          </w:p>
+        </w:tc>
+        <w:tc>
+          <w:tcPr>
+            <w:tcW w:type="dxa" w:w="536"/>
+            <w:tcMar>
+              <w:top w:type="dxa" w:w="60"/>
+              <w:left w:type="dxa" w:w="100"/>
+              <w:bottom w:type="dxa" w:w="60"/>
+              <w:right w:type="dxa" w:w="100"/>
+            </w:tcMar>
+          </w:tcPr>
+          <w:p>
+            <w:pPr>
+              <w:spacing w:after="20" w:before="20"/>
+            </w:pPr>
+          </w:p>
+        </w:tc>
+        <w:tc>
+          <w:tcPr>
+            <w:tcW w:type="dxa" w:w="536"/>
+            <w:tcMar>
+              <w:top w:type="dxa" w:w="60"/>
+              <w:left w:type="dxa" w:w="100"/>
+              <w:bottom w:type="dxa" w:w="60"/>
+              <w:right w:type="dxa" w:w="100"/>
+            </w:tcMar>
+          </w:tcPr>
+          <w:p>
+            <w:pPr>
+              <w:spacing w:after="20" w:before="20"/>
+            </w:pPr>
+          </w:p>
+        </w:tc>
+        <w:tc>
+          <w:tcPr>
+            <w:tcW w:type="dxa" w:w="536"/>
+            <w:tcMar>
+              <w:top w:type="dxa" w:w="60"/>
+              <w:left w:type="dxa" w:w="100"/>
+              <w:bottom w:type="dxa" w:w="60"/>
+              <w:right w:type="dxa" w:w="100"/>
+            </w:tcMar>
+          </w:tcPr>
+          <w:p>
+            <w:pPr>
+              <w:spacing w:after="20" w:before="20"/>
+            </w:pPr>
+          </w:p>
+        </w:tc>
+        <w:tc>
+          <w:tcPr>
+            <w:tcW w:type="dxa" w:w="536"/>
+            <w:tcMar>
+              <w:top w:type="dxa" w:w="60"/>
+              <w:left w:type="dxa" w:w="100"/>
+              <w:bottom w:type="dxa" w:w="60"/>
+              <w:right w:type="dxa" w:w="100"/>
+            </w:tcMar>
+          </w:tcPr>
+          <w:p>
+            <w:pPr>
+              <w:spacing w:after="20" w:before="20"/>
+            </w:pPr>
+          </w:p>
+        </w:tc>
+        <w:tc>
+          <w:tcPr>
+            <w:tcW w:type="dxa" w:w="536"/>
+            <w:tcMar>
+              <w:top w:type="dxa" w:w="60"/>
+              <w:left w:type="dxa" w:w="100"/>
+              <w:bottom w:type="dxa" w:w="60"/>
+              <w:right w:type="dxa" w:w="100"/>
+            </w:tcMar>
+          </w:tcPr>
+          <w:p>
+            <w:pPr>
+              <w:spacing w:after="20" w:before="20"/>
+            </w:pPr>
+          </w:p>
+        </w:tc>
+        <w:tc>
+          <w:tcPr>
+            <w:tcW w:type="dxa" w:w="536"/>
+            <w:tcMar>
+              <w:top w:type="dxa" w:w="60"/>
+              <w:left w:type="dxa" w:w="100"/>
+              <w:bottom w:type="dxa" w:w="60"/>
+              <w:right w:type="dxa" w:w="100"/>
+            </w:tcMar>
+          </w:tcPr>
+          <w:p>
+            <w:pPr>
+              <w:spacing w:after="20" w:before="20"/>
+            </w:pPr>
+          </w:p>
+        </w:tc>
+        <w:tc>
+          <w:tcPr>
+            <w:tcW w:type="dxa" w:w="536"/>
+            <w:tcMar>
+              <w:top w:type="dxa" w:w="60"/>
+              <w:left w:type="dxa" w:w="100"/>
+              <w:bottom w:type="dxa" w:w="60"/>
+              <w:right w:type="dxa" w:w="100"/>
+            </w:tcMar>
+          </w:tcPr>
+          <w:p>
+            <w:pPr>
+              <w:spacing w:after="20" w:before="20"/>
+            </w:pPr>
+          </w:p>
+        </w:tc>
+        <w:tc>
+          <w:tcPr>
+            <w:tcW w:type="dxa" w:w="536"/>
+            <w:tcMar>
+              <w:top w:type="dxa" w:w="60"/>
+              <w:left w:type="dxa" w:w="100"/>
+              <w:bottom w:type="dxa" w:w="60"/>
+              <w:right w:type="dxa" w:w="100"/>
+            </w:tcMar>
+          </w:tcPr>
+          <w:p>
+            <w:pPr>
+              <w:spacing w:after="20" w:before="20"/>
+            </w:pPr>
+          </w:p>
+        </w:tc>
+      </w:tr>
+      <w:tr>
+        <w:trPr>
+          <w:tblHeader w:val="false"/>
+        </w:trPr>
+        <w:tc>
+          <w:tcPr>
+            <w:tcW w:type="dxa" w:w="3314"/>
+            <w:tcMar>
+              <w:top w:type="dxa" w:w="60"/>
+              <w:left w:type="dxa" w:w="100"/>
+              <w:bottom w:type="dxa" w:w="60"/>
+              <w:right w:type="dxa" w:w="100"/>
+            </w:tcMar>
+          </w:tcPr>
+          <w:p>
+            <w:pPr>
+              <w:spacing w:after="20" w:before="20"/>
+            </w:pPr>
+            <w:r>
+              <w:t xml:space="preserve">2 — Tournament Setup &amp; Clock</w:t>
+            </w:r>
+          </w:p>
+        </w:tc>
+        <w:tc>
+          <w:tcPr>
+            <w:tcW w:type="dxa" w:w="536"/>
+            <w:tcMar>
+              <w:top w:type="dxa" w:w="60"/>
+              <w:left w:type="dxa" w:w="100"/>
+              <w:bottom w:type="dxa" w:w="60"/>
+              <w:right w:type="dxa" w:w="100"/>
+            </w:tcMar>
+          </w:tcPr>
+          <w:p>
+            <w:pPr>
+              <w:spacing w:after="20" w:before="20"/>
+            </w:pPr>
+          </w:p>
+        </w:tc>
+        <w:tc>
+          <w:tcPr>
+            <w:tcW w:type="dxa" w:w="536"/>
+            <w:tcMar>
+              <w:top w:type="dxa" w:w="60"/>
+              <w:left w:type="dxa" w:w="100"/>
+              <w:bottom w:type="dxa" w:w="60"/>
+              <w:right w:type="dxa" w:w="100"/>
+            </w:tcMar>
+          </w:tcPr>
+          <w:p>
+            <w:pPr>
+              <w:spacing w:after="20" w:before="20"/>
+            </w:pPr>
+          </w:p>
+        </w:tc>
+        <w:tc>
+          <w:tcPr>
+            <w:tcW w:type="dxa" w:w="536"/>
+            <w:tcMar>
+              <w:top w:type="dxa" w:w="60"/>
+              <w:left w:type="dxa" w:w="100"/>
+              <w:bottom w:type="dxa" w:w="60"/>
+              <w:right w:type="dxa" w:w="100"/>
+            </w:tcMar>
+          </w:tcPr>
+          <w:p>
+            <w:pPr>
+              <w:spacing w:after="20" w:before="20"/>
+            </w:pPr>
+            <w:r>
+              <w:t xml:space="preserve">██</w:t>
+            </w:r>
+          </w:p>
+        </w:tc>
+        <w:tc>
+          <w:tcPr>
+            <w:tcW w:type="dxa" w:w="536"/>
+            <w:tcMar>
+              <w:top w:type="dxa" w:w="60"/>
+              <w:left w:type="dxa" w:w="100"/>
+              <w:bottom w:type="dxa" w:w="60"/>
+              <w:right w:type="dxa" w:w="100"/>
+            </w:tcMar>
+          </w:tcPr>
+          <w:p>
+            <w:pPr>
+              <w:spacing w:after="20" w:before="20"/>
+            </w:pPr>
+            <w:r>
+              <w:t xml:space="preserve">██</w:t>
+            </w:r>
+          </w:p>
+        </w:tc>
+        <w:tc>
+          <w:tcPr>
+            <w:tcW w:type="dxa" w:w="536"/>
+            <w:tcMar>
+              <w:top w:type="dxa" w:w="60"/>
+              <w:left w:type="dxa" w:w="100"/>
+              <w:bottom w:type="dxa" w:w="60"/>
+              <w:right w:type="dxa" w:w="100"/>
+            </w:tcMar>
+          </w:tcPr>
+          <w:p>
+            <w:pPr>
+              <w:spacing w:after="20" w:before="20"/>
+            </w:pPr>
+            <w:r>
+              <w:t xml:space="preserve">██</w:t>
+            </w:r>
+          </w:p>
+        </w:tc>
+        <w:tc>
+          <w:tcPr>
+            <w:tcW w:type="dxa" w:w="536"/>
+            <w:tcMar>
+              <w:top w:type="dxa" w:w="60"/>
+              <w:left w:type="dxa" w:w="100"/>
+              <w:bottom w:type="dxa" w:w="60"/>
+              <w:right w:type="dxa" w:w="100"/>
+            </w:tcMar>
+          </w:tcPr>
+          <w:p>
+            <w:pPr>
+              <w:spacing w:after="20" w:before="20"/>
+            </w:pPr>
+          </w:p>
+        </w:tc>
+        <w:tc>
+          <w:tcPr>
+            <w:tcW w:type="dxa" w:w="536"/>
+            <w:tcMar>
+              <w:top w:type="dxa" w:w="60"/>
+              <w:left w:type="dxa" w:w="100"/>
+              <w:bottom w:type="dxa" w:w="60"/>
+              <w:right w:type="dxa" w:w="100"/>
+            </w:tcMar>
+          </w:tcPr>
+          <w:p>
+            <w:pPr>
+              <w:spacing w:after="20" w:before="20"/>
+            </w:pPr>
+          </w:p>
+        </w:tc>
+        <w:tc>
+          <w:tcPr>
+            <w:tcW w:type="dxa" w:w="536"/>
+            <w:tcMar>
+              <w:top w:type="dxa" w:w="60"/>
+              <w:left w:type="dxa" w:w="100"/>
+              <w:bottom w:type="dxa" w:w="60"/>
+              <w:right w:type="dxa" w:w="100"/>
+            </w:tcMar>
+          </w:tcPr>
+          <w:p>
+            <w:pPr>
+              <w:spacing w:after="20" w:before="20"/>
+            </w:pPr>
+          </w:p>
+        </w:tc>
+        <w:tc>
+          <w:tcPr>
+            <w:tcW w:type="dxa" w:w="536"/>
+            <w:tcMar>
+              <w:top w:type="dxa" w:w="60"/>
+              <w:left w:type="dxa" w:w="100"/>
+              <w:bottom w:type="dxa" w:w="60"/>
+              <w:right w:type="dxa" w:w="100"/>
+            </w:tcMar>
+          </w:tcPr>
+          <w:p>
+            <w:pPr>
+              <w:spacing w:after="20" w:before="20"/>
+            </w:pPr>
+          </w:p>
+        </w:tc>
+        <w:tc>
+          <w:tcPr>
+            <w:tcW w:type="dxa" w:w="536"/>
+            <w:tcMar>
+              <w:top w:type="dxa" w:w="60"/>
+              <w:left w:type="dxa" w:w="100"/>
+              <w:bottom w:type="dxa" w:w="60"/>
+              <w:right w:type="dxa" w:w="100"/>
+            </w:tcMar>
+          </w:tcPr>
+          <w:p>
+            <w:pPr>
+              <w:spacing w:after="20" w:before="20"/>
+            </w:pPr>
+          </w:p>
+        </w:tc>
+        <w:tc>
+          <w:tcPr>
+            <w:tcW w:type="dxa" w:w="536"/>
+            <w:tcMar>
+              <w:top w:type="dxa" w:w="60"/>
+              <w:left w:type="dxa" w:w="100"/>
+              <w:bottom w:type="dxa" w:w="60"/>
+              <w:right w:type="dxa" w:w="100"/>
+            </w:tcMar>
+          </w:tcPr>
+          <w:p>
+            <w:pPr>
+              <w:spacing w:after="20" w:before="20"/>
+            </w:pPr>
+          </w:p>
+        </w:tc>
+        <w:tc>
+          <w:tcPr>
+            <w:tcW w:type="dxa" w:w="536"/>
+            <w:tcMar>
+              <w:top w:type="dxa" w:w="60"/>
+              <w:left w:type="dxa" w:w="100"/>
+              <w:bottom w:type="dxa" w:w="60"/>
+              <w:right w:type="dxa" w:w="100"/>
+            </w:tcMar>
+          </w:tcPr>
+          <w:p>
+            <w:pPr>
+              <w:spacing w:after="20" w:before="20"/>
+            </w:pPr>
+          </w:p>
+        </w:tc>
+      </w:tr>
+      <w:tr>
+        <w:trPr>
+          <w:tblHeader w:val="false"/>
+        </w:trPr>
+        <w:tc>
+          <w:tcPr>
+            <w:tcW w:type="dxa" w:w="3314"/>
+            <w:tcMar>
+              <w:top w:type="dxa" w:w="60"/>
+              <w:left w:type="dxa" w:w="100"/>
+              <w:bottom w:type="dxa" w:w="60"/>
+              <w:right w:type="dxa" w:w="100"/>
+            </w:tcMar>
+          </w:tcPr>
+          <w:p>
+            <w:pPr>
+              <w:spacing w:after="20" w:before="20"/>
+            </w:pPr>
+            <w:r>
+              <w:t xml:space="preserve">3 — Registration, Seating, Wallet</w:t>
+            </w:r>
+          </w:p>
+        </w:tc>
+        <w:tc>
+          <w:tcPr>
+            <w:tcW w:type="dxa" w:w="536"/>
+            <w:tcMar>
+              <w:top w:type="dxa" w:w="60"/>
+              <w:left w:type="dxa" w:w="100"/>
+              <w:bottom w:type="dxa" w:w="60"/>
+              <w:right w:type="dxa" w:w="100"/>
+            </w:tcMar>
+          </w:tcPr>
+          <w:p>
+            <w:pPr>
+              <w:spacing w:after="20" w:before="20"/>
+            </w:pPr>
+          </w:p>
+        </w:tc>
+        <w:tc>
+          <w:tcPr>
+            <w:tcW w:type="dxa" w:w="536"/>
+            <w:tcMar>
+              <w:top w:type="dxa" w:w="60"/>
+              <w:left w:type="dxa" w:w="100"/>
+              <w:bottom w:type="dxa" w:w="60"/>
+              <w:right w:type="dxa" w:w="100"/>
+            </w:tcMar>
+          </w:tcPr>
+          <w:p>
+            <w:pPr>
+              <w:spacing w:after="20" w:before="20"/>
+            </w:pPr>
+          </w:p>
+        </w:tc>
+        <w:tc>
+          <w:tcPr>
+            <w:tcW w:type="dxa" w:w="536"/>
+            <w:tcMar>
+              <w:top w:type="dxa" w:w="60"/>
+              <w:left w:type="dxa" w:w="100"/>
+              <w:bottom w:type="dxa" w:w="60"/>
+              <w:right w:type="dxa" w:w="100"/>
+            </w:tcMar>
+          </w:tcPr>
+          <w:p>
+            <w:pPr>
+              <w:spacing w:after="20" w:before="20"/>
+            </w:pPr>
+          </w:p>
+        </w:tc>
+        <w:tc>
+          <w:tcPr>
+            <w:tcW w:type="dxa" w:w="536"/>
+            <w:tcMar>
+              <w:top w:type="dxa" w:w="60"/>
+              <w:left w:type="dxa" w:w="100"/>
+              <w:bottom w:type="dxa" w:w="60"/>
+              <w:right w:type="dxa" w:w="100"/>
+            </w:tcMar>
+          </w:tcPr>
+          <w:p>
+            <w:pPr>
+              <w:spacing w:after="20" w:before="20"/>
+            </w:pPr>
+          </w:p>
+        </w:tc>
+        <w:tc>
+          <w:tcPr>
+            <w:tcW w:type="dxa" w:w="536"/>
+            <w:tcMar>
+              <w:top w:type="dxa" w:w="60"/>
+              <w:left w:type="dxa" w:w="100"/>
+              <w:bottom w:type="dxa" w:w="60"/>
+              <w:right w:type="dxa" w:w="100"/>
+            </w:tcMar>
+          </w:tcPr>
+          <w:p>
+            <w:pPr>
+              <w:spacing w:after="20" w:before="20"/>
+            </w:pPr>
+            <w:r>
+              <w:t xml:space="preserve">██</w:t>
+            </w:r>
+          </w:p>
+        </w:tc>
+        <w:tc>
+          <w:tcPr>
+            <w:tcW w:type="dxa" w:w="536"/>
+            <w:tcMar>
+              <w:top w:type="dxa" w:w="60"/>
+              <w:left w:type="dxa" w:w="100"/>
+              <w:bottom w:type="dxa" w:w="60"/>
+              <w:right w:type="dxa" w:w="100"/>
+            </w:tcMar>
+          </w:tcPr>
+          <w:p>
+            <w:pPr>
+              <w:spacing w:after="20" w:before="20"/>
+            </w:pPr>
+            <w:r>
+              <w:t xml:space="preserve">██</w:t>
+            </w:r>
+          </w:p>
+        </w:tc>
+        <w:tc>
+          <w:tcPr>
+            <w:tcW w:type="dxa" w:w="536"/>
+            <w:tcMar>
+              <w:top w:type="dxa" w:w="60"/>
+              <w:left w:type="dxa" w:w="100"/>
+              <w:bottom w:type="dxa" w:w="60"/>
+              <w:right w:type="dxa" w:w="100"/>
+            </w:tcMar>
+          </w:tcPr>
+          <w:p>
+            <w:pPr>
+              <w:spacing w:after="20" w:before="20"/>
+            </w:pPr>
+            <w:r>
+              <w:t xml:space="preserve">██</w:t>
+            </w:r>
+          </w:p>
+        </w:tc>
+        <w:tc>
+          <w:tcPr>
+            <w:tcW w:type="dxa" w:w="536"/>
+            <w:tcMar>
+              <w:top w:type="dxa" w:w="60"/>
+              <w:left w:type="dxa" w:w="100"/>
+              <w:bottom w:type="dxa" w:w="60"/>
+              <w:right w:type="dxa" w:w="100"/>
+            </w:tcMar>
+          </w:tcPr>
+          <w:p>
+            <w:pPr>
+              <w:spacing w:after="20" w:before="20"/>
+            </w:pPr>
+            <w:r>
+              <w:t xml:space="preserve">██</w:t>
+            </w:r>
+          </w:p>
+        </w:tc>
+        <w:tc>
+          <w:tcPr>
+            <w:tcW w:type="dxa" w:w="536"/>
+            <w:tcMar>
+              <w:top w:type="dxa" w:w="60"/>
+              <w:left w:type="dxa" w:w="100"/>
+              <w:bottom w:type="dxa" w:w="60"/>
+              <w:right w:type="dxa" w:w="100"/>
+            </w:tcMar>
+          </w:tcPr>
+          <w:p>
+            <w:pPr>
+              <w:spacing w:after="20" w:before="20"/>
+            </w:pPr>
+          </w:p>
+        </w:tc>
+        <w:tc>
+          <w:tcPr>
+            <w:tcW w:type="dxa" w:w="536"/>
+            <w:tcMar>
+              <w:top w:type="dxa" w:w="60"/>
+              <w:left w:type="dxa" w:w="100"/>
+              <w:bottom w:type="dxa" w:w="60"/>
+              <w:right w:type="dxa" w:w="100"/>
+            </w:tcMar>
+          </w:tcPr>
+          <w:p>
+            <w:pPr>
+              <w:spacing w:after="20" w:before="20"/>
+            </w:pPr>
+          </w:p>
+        </w:tc>
+        <w:tc>
+          <w:tcPr>
+            <w:tcW w:type="dxa" w:w="536"/>
+            <w:tcMar>
+              <w:top w:type="dxa" w:w="60"/>
+              <w:left w:type="dxa" w:w="100"/>
+              <w:bottom w:type="dxa" w:w="60"/>
+              <w:right w:type="dxa" w:w="100"/>
+            </w:tcMar>
+          </w:tcPr>
+          <w:p>
+            <w:pPr>
+              <w:spacing w:after="20" w:before="20"/>
+            </w:pPr>
+          </w:p>
+        </w:tc>
+        <w:tc>
+          <w:tcPr>
+            <w:tcW w:type="dxa" w:w="536"/>
+            <w:tcMar>
+              <w:top w:type="dxa" w:w="60"/>
+              <w:left w:type="dxa" w:w="100"/>
+              <w:bottom w:type="dxa" w:w="60"/>
+              <w:right w:type="dxa" w:w="100"/>
+            </w:tcMar>
+          </w:tcPr>
+          <w:p>
+            <w:pPr>
+              <w:spacing w:after="20" w:before="20"/>
+            </w:pPr>
+          </w:p>
+        </w:tc>
+      </w:tr>
+      <w:tr>
+        <w:trPr>
+          <w:tblHeader w:val="false"/>
+        </w:trPr>
+        <w:tc>
+          <w:tcPr>
+            <w:tcW w:type="dxa" w:w="3314"/>
+            <w:tcMar>
+              <w:top w:type="dxa" w:w="60"/>
+              <w:left w:type="dxa" w:w="100"/>
+              <w:bottom w:type="dxa" w:w="60"/>
+              <w:right w:type="dxa" w:w="100"/>
+            </w:tcMar>
+          </w:tcPr>
+          <w:p>
+            <w:pPr>
+              <w:spacing w:after="20" w:before="20"/>
+            </w:pPr>
+            <w:r>
+              <w:t xml:space="preserve">4 — Payouts, Results &amp; Withdrawals</w:t>
+            </w:r>
+          </w:p>
+        </w:tc>
+        <w:tc>
+          <w:tcPr>
+            <w:tcW w:type="dxa" w:w="536"/>
+            <w:tcMar>
+              <w:top w:type="dxa" w:w="60"/>
+              <w:left w:type="dxa" w:w="100"/>
+              <w:bottom w:type="dxa" w:w="60"/>
+              <w:right w:type="dxa" w:w="100"/>
+            </w:tcMar>
+          </w:tcPr>
+          <w:p>
+            <w:pPr>
+              <w:spacing w:after="20" w:before="20"/>
+            </w:pPr>
+          </w:p>
+        </w:tc>
+        <w:tc>
+          <w:tcPr>
+            <w:tcW w:type="dxa" w:w="536"/>
+            <w:tcMar>
+              <w:top w:type="dxa" w:w="60"/>
+              <w:left w:type="dxa" w:w="100"/>
+              <w:bottom w:type="dxa" w:w="60"/>
+              <w:right w:type="dxa" w:w="100"/>
+            </w:tcMar>
+          </w:tcPr>
+          <w:p>
+            <w:pPr>
+              <w:spacing w:after="20" w:before="20"/>
+            </w:pPr>
+          </w:p>
+        </w:tc>
+        <w:tc>
+          <w:tcPr>
+            <w:tcW w:type="dxa" w:w="536"/>
+            <w:tcMar>
+              <w:top w:type="dxa" w:w="60"/>
+              <w:left w:type="dxa" w:w="100"/>
+              <w:bottom w:type="dxa" w:w="60"/>
+              <w:right w:type="dxa" w:w="100"/>
+            </w:tcMar>
+          </w:tcPr>
+          <w:p>
+            <w:pPr>
+              <w:spacing w:after="20" w:before="20"/>
+            </w:pPr>
+          </w:p>
+        </w:tc>
+        <w:tc>
+          <w:tcPr>
+            <w:tcW w:type="dxa" w:w="536"/>
+            <w:tcMar>
+              <w:top w:type="dxa" w:w="60"/>
+              <w:left w:type="dxa" w:w="100"/>
+              <w:bottom w:type="dxa" w:w="60"/>
+              <w:right w:type="dxa" w:w="100"/>
+            </w:tcMar>
+          </w:tcPr>
+          <w:p>
+            <w:pPr>
+              <w:spacing w:after="20" w:before="20"/>
+            </w:pPr>
+          </w:p>
+        </w:tc>
+        <w:tc>
+          <w:tcPr>
+            <w:tcW w:type="dxa" w:w="536"/>
+            <w:tcMar>
+              <w:top w:type="dxa" w:w="60"/>
+              <w:left w:type="dxa" w:w="100"/>
+              <w:bottom w:type="dxa" w:w="60"/>
+              <w:right w:type="dxa" w:w="100"/>
+            </w:tcMar>
+          </w:tcPr>
+          <w:p>
+            <w:pPr>
+              <w:spacing w:after="20" w:before="20"/>
+            </w:pPr>
+          </w:p>
+        </w:tc>
+        <w:tc>
+          <w:tcPr>
+            <w:tcW w:type="dxa" w:w="536"/>
+            <w:tcMar>
+              <w:top w:type="dxa" w:w="60"/>
+              <w:left w:type="dxa" w:w="100"/>
+              <w:bottom w:type="dxa" w:w="60"/>
+              <w:right w:type="dxa" w:w="100"/>
+            </w:tcMar>
+          </w:tcPr>
+          <w:p>
+            <w:pPr>
+              <w:spacing w:after="20" w:before="20"/>
+            </w:pPr>
+          </w:p>
+        </w:tc>
+        <w:tc>
+          <w:tcPr>
+            <w:tcW w:type="dxa" w:w="536"/>
+            <w:tcMar>
+              <w:top w:type="dxa" w:w="60"/>
+              <w:left w:type="dxa" w:w="100"/>
+              <w:bottom w:type="dxa" w:w="60"/>
+              <w:right w:type="dxa" w:w="100"/>
+            </w:tcMar>
+          </w:tcPr>
+          <w:p>
+            <w:pPr>
+              <w:spacing w:after="20" w:before="20"/>
+            </w:pPr>
+          </w:p>
+        </w:tc>
+        <w:tc>
+          <w:tcPr>
+            <w:tcW w:type="dxa" w:w="536"/>
+            <w:tcMar>
+              <w:top w:type="dxa" w:w="60"/>
+              <w:left w:type="dxa" w:w="100"/>
+              <w:bottom w:type="dxa" w:w="60"/>
+              <w:right w:type="dxa" w:w="100"/>
+            </w:tcMar>
+          </w:tcPr>
+          <w:p>
+            <w:pPr>
+              <w:spacing w:after="20" w:before="20"/>
+            </w:pPr>
+            <w:r>
+              <w:t xml:space="preserve">██</w:t>
+            </w:r>
+          </w:p>
+        </w:tc>
+        <w:tc>
+          <w:tcPr>
+            <w:tcW w:type="dxa" w:w="536"/>
+            <w:tcMar>
+              <w:top w:type="dxa" w:w="60"/>
+              <w:left w:type="dxa" w:w="100"/>
+              <w:bottom w:type="dxa" w:w="60"/>
+              <w:right w:type="dxa" w:w="100"/>
+            </w:tcMar>
+          </w:tcPr>
+          <w:p>
+            <w:pPr>
+              <w:spacing w:after="20" w:before="20"/>
+            </w:pPr>
+            <w:r>
+              <w:t xml:space="preserve">██</w:t>
+            </w:r>
+          </w:p>
+        </w:tc>
+        <w:tc>
+          <w:tcPr>
+            <w:tcW w:type="dxa" w:w="536"/>
+            <w:tcMar>
+              <w:top w:type="dxa" w:w="60"/>
+              <w:left w:type="dxa" w:w="100"/>
+              <w:bottom w:type="dxa" w:w="60"/>
+              <w:right w:type="dxa" w:w="100"/>
+            </w:tcMar>
+          </w:tcPr>
+          <w:p>
+            <w:pPr>
+              <w:spacing w:after="20" w:before="20"/>
+            </w:pPr>
+            <w:r>
+              <w:t xml:space="preserve">██</w:t>
+            </w:r>
+          </w:p>
+        </w:tc>
+        <w:tc>
+          <w:tcPr>
+            <w:tcW w:type="dxa" w:w="536"/>
+            <w:tcMar>
+              <w:top w:type="dxa" w:w="60"/>
+              <w:left w:type="dxa" w:w="100"/>
+              <w:bottom w:type="dxa" w:w="60"/>
+              <w:right w:type="dxa" w:w="100"/>
+            </w:tcMar>
+          </w:tcPr>
+          <w:p>
+            <w:pPr>
+              <w:spacing w:after="20" w:before="20"/>
+            </w:pPr>
+          </w:p>
+        </w:tc>
+        <w:tc>
+          <w:tcPr>
+            <w:tcW w:type="dxa" w:w="536"/>
+            <w:tcMar>
+              <w:top w:type="dxa" w:w="60"/>
+              <w:left w:type="dxa" w:w="100"/>
+              <w:bottom w:type="dxa" w:w="60"/>
+              <w:right w:type="dxa" w:w="100"/>
+            </w:tcMar>
+          </w:tcPr>
+          <w:p>
+            <w:pPr>
+              <w:spacing w:after="20" w:before="20"/>
+            </w:pPr>
+          </w:p>
+        </w:tc>
+      </w:tr>
+      <w:tr>
+        <w:trPr>
+          <w:tblHeader w:val="false"/>
+        </w:trPr>
+        <w:tc>
+          <w:tcPr>
+            <w:tcW w:type="dxa" w:w="3314"/>
+            <w:tcMar>
+              <w:top w:type="dxa" w:w="60"/>
+              <w:left w:type="dxa" w:w="100"/>
+              <w:bottom w:type="dxa" w:w="60"/>
+              <w:right w:type="dxa" w:w="100"/>
+            </w:tcMar>
+          </w:tcPr>
+          <w:p>
+            <w:pPr>
+              <w:spacing w:after="20" w:before="20"/>
+            </w:pPr>
+            <w:r>
+              <w:t xml:space="preserve">5 — Display &amp; iPad Polish</w:t>
+            </w:r>
+          </w:p>
+        </w:tc>
+        <w:tc>
+          <w:tcPr>
+            <w:tcW w:type="dxa" w:w="536"/>
+            <w:tcMar>
+              <w:top w:type="dxa" w:w="60"/>
+              <w:left w:type="dxa" w:w="100"/>
+              <w:bottom w:type="dxa" w:w="60"/>
+              <w:right w:type="dxa" w:w="100"/>
+            </w:tcMar>
+          </w:tcPr>
+          <w:p>
+            <w:pPr>
+              <w:spacing w:after="20" w:before="20"/>
+            </w:pPr>
+          </w:p>
+        </w:tc>
+        <w:tc>
+          <w:tcPr>
+            <w:tcW w:type="dxa" w:w="536"/>
+            <w:tcMar>
+              <w:top w:type="dxa" w:w="60"/>
+              <w:left w:type="dxa" w:w="100"/>
+              <w:bottom w:type="dxa" w:w="60"/>
+              <w:right w:type="dxa" w:w="100"/>
+            </w:tcMar>
+          </w:tcPr>
+          <w:p>
+            <w:pPr>
+              <w:spacing w:after="20" w:before="20"/>
+            </w:pPr>
+          </w:p>
+        </w:tc>
+        <w:tc>
+          <w:tcPr>
+            <w:tcW w:type="dxa" w:w="536"/>
+            <w:tcMar>
+              <w:top w:type="dxa" w:w="60"/>
+              <w:left w:type="dxa" w:w="100"/>
+              <w:bottom w:type="dxa" w:w="60"/>
+              <w:right w:type="dxa" w:w="100"/>
+            </w:tcMar>
+          </w:tcPr>
+          <w:p>
+            <w:pPr>
+              <w:spacing w:after="20" w:before="20"/>
+            </w:pPr>
+          </w:p>
+        </w:tc>
+        <w:tc>
+          <w:tcPr>
+            <w:tcW w:type="dxa" w:w="536"/>
+            <w:tcMar>
+              <w:top w:type="dxa" w:w="60"/>
+              <w:left w:type="dxa" w:w="100"/>
+              <w:bottom w:type="dxa" w:w="60"/>
+              <w:right w:type="dxa" w:w="100"/>
+            </w:tcMar>
+          </w:tcPr>
+          <w:p>
+            <w:pPr>
+              <w:spacing w:after="20" w:before="20"/>
+            </w:pPr>
+          </w:p>
+        </w:tc>
+        <w:tc>
+          <w:tcPr>
+            <w:tcW w:type="dxa" w:w="536"/>
+            <w:tcMar>
+              <w:top w:type="dxa" w:w="60"/>
+              <w:left w:type="dxa" w:w="100"/>
+              <w:bottom w:type="dxa" w:w="60"/>
+              <w:right w:type="dxa" w:w="100"/>
+            </w:tcMar>
+          </w:tcPr>
+          <w:p>
+            <w:pPr>
+              <w:spacing w:after="20" w:before="20"/>
+            </w:pPr>
+          </w:p>
+        </w:tc>
+        <w:tc>
+          <w:tcPr>
+            <w:tcW w:type="dxa" w:w="536"/>
+            <w:tcMar>
+              <w:top w:type="dxa" w:w="60"/>
+              <w:left w:type="dxa" w:w="100"/>
+              <w:bottom w:type="dxa" w:w="60"/>
+              <w:right w:type="dxa" w:w="100"/>
+            </w:tcMar>
+          </w:tcPr>
+          <w:p>
+            <w:pPr>
+              <w:spacing w:after="20" w:before="20"/>
+            </w:pPr>
+          </w:p>
+        </w:tc>
+        <w:tc>
+          <w:tcPr>
+            <w:tcW w:type="dxa" w:w="536"/>
+            <w:tcMar>
+              <w:top w:type="dxa" w:w="60"/>
+              <w:left w:type="dxa" w:w="100"/>
+              <w:bottom w:type="dxa" w:w="60"/>
+              <w:right w:type="dxa" w:w="100"/>
+            </w:tcMar>
+          </w:tcPr>
+          <w:p>
+            <w:pPr>
+              <w:spacing w:after="20" w:before="20"/>
+            </w:pPr>
+          </w:p>
+        </w:tc>
+        <w:tc>
+          <w:tcPr>
+            <w:tcW w:type="dxa" w:w="536"/>
+            <w:tcMar>
+              <w:top w:type="dxa" w:w="60"/>
+              <w:left w:type="dxa" w:w="100"/>
+              <w:bottom w:type="dxa" w:w="60"/>
+              <w:right w:type="dxa" w:w="100"/>
+            </w:tcMar>
+          </w:tcPr>
+          <w:p>
+            <w:pPr>
+              <w:spacing w:after="20" w:before="20"/>
+            </w:pPr>
+          </w:p>
+        </w:tc>
+        <w:tc>
+          <w:tcPr>
+            <w:tcW w:type="dxa" w:w="536"/>
+            <w:tcMar>
+              <w:top w:type="dxa" w:w="60"/>
+              <w:left w:type="dxa" w:w="100"/>
+              <w:bottom w:type="dxa" w:w="60"/>
+              <w:right w:type="dxa" w:w="100"/>
+            </w:tcMar>
+          </w:tcPr>
+          <w:p>
+            <w:pPr>
+              <w:spacing w:after="20" w:before="20"/>
+            </w:pPr>
+          </w:p>
+        </w:tc>
+        <w:tc>
+          <w:tcPr>
+            <w:tcW w:type="dxa" w:w="536"/>
+            <w:tcMar>
+              <w:top w:type="dxa" w:w="60"/>
+              <w:left w:type="dxa" w:w="100"/>
+              <w:bottom w:type="dxa" w:w="60"/>
+              <w:right w:type="dxa" w:w="100"/>
+            </w:tcMar>
+          </w:tcPr>
+          <w:p>
+            <w:pPr>
+              <w:spacing w:after="20" w:before="20"/>
+            </w:pPr>
+            <w:r>
+              <w:t xml:space="preserve">██</w:t>
+            </w:r>
+          </w:p>
+        </w:tc>
+        <w:tc>
+          <w:tcPr>
+            <w:tcW w:type="dxa" w:w="536"/>
+            <w:tcMar>
+              <w:top w:type="dxa" w:w="60"/>
+              <w:left w:type="dxa" w:w="100"/>
+              <w:bottom w:type="dxa" w:w="60"/>
+              <w:right w:type="dxa" w:w="100"/>
+            </w:tcMar>
+          </w:tcPr>
+          <w:p>
+            <w:pPr>
+              <w:spacing w:after="20" w:before="20"/>
+            </w:pPr>
+            <w:r>
+              <w:t xml:space="preserve">██</w:t>
+            </w:r>
+          </w:p>
+        </w:tc>
+        <w:tc>
+          <w:tcPr>
+            <w:tcW w:type="dxa" w:w="536"/>
+            <w:tcMar>
+              <w:top w:type="dxa" w:w="60"/>
+              <w:left w:type="dxa" w:w="100"/>
+              <w:bottom w:type="dxa" w:w="60"/>
+              <w:right w:type="dxa" w:w="100"/>
+            </w:tcMar>
+          </w:tcPr>
+          <w:p>
+            <w:pPr>
+              <w:spacing w:after="20" w:before="20"/>
+            </w:pPr>
+          </w:p>
+        </w:tc>
+      </w:tr>
+      <w:tr>
+        <w:trPr>
+          <w:tblHeader w:val="false"/>
+        </w:trPr>
+        <w:tc>
+          <w:tcPr>
+            <w:tcW w:type="dxa" w:w="3314"/>
+            <w:tcMar>
+              <w:top w:type="dxa" w:w="60"/>
+              <w:left w:type="dxa" w:w="100"/>
+              <w:bottom w:type="dxa" w:w="60"/>
+              <w:right w:type="dxa" w:w="100"/>
+            </w:tcMar>
+          </w:tcPr>
+          <w:p>
+            <w:pPr>
+              <w:spacing w:after="20" w:before="20"/>
+            </w:pPr>
+            <w:r>
+              <w:t xml:space="preserve">6 — Consumer-app Adaptors</w:t>
+            </w:r>
+          </w:p>
+        </w:tc>
+        <w:tc>
+          <w:tcPr>
+            <w:tcW w:type="dxa" w:w="536"/>
+            <w:tcMar>
+              <w:top w:type="dxa" w:w="60"/>
+              <w:left w:type="dxa" w:w="100"/>
+              <w:bottom w:type="dxa" w:w="60"/>
+              <w:right w:type="dxa" w:w="100"/>
+            </w:tcMar>
+          </w:tcPr>
+          <w:p>
+            <w:pPr>
+              <w:spacing w:after="20" w:before="20"/>
+            </w:pPr>
+          </w:p>
+        </w:tc>
+        <w:tc>
+          <w:tcPr>
+            <w:tcW w:type="dxa" w:w="536"/>
+            <w:tcMar>
+              <w:top w:type="dxa" w:w="60"/>
+              <w:left w:type="dxa" w:w="100"/>
+              <w:bottom w:type="dxa" w:w="60"/>
+              <w:right w:type="dxa" w:w="100"/>
+            </w:tcMar>
+          </w:tcPr>
+          <w:p>
+            <w:pPr>
+              <w:spacing w:after="20" w:before="20"/>
+            </w:pPr>
+          </w:p>
+        </w:tc>
+        <w:tc>
+          <w:tcPr>
+            <w:tcW w:type="dxa" w:w="536"/>
+            <w:tcMar>
+              <w:top w:type="dxa" w:w="60"/>
+              <w:left w:type="dxa" w:w="100"/>
+              <w:bottom w:type="dxa" w:w="60"/>
+              <w:right w:type="dxa" w:w="100"/>
+            </w:tcMar>
+          </w:tcPr>
+          <w:p>
+            <w:pPr>
+              <w:spacing w:after="20" w:before="20"/>
+            </w:pPr>
+          </w:p>
+        </w:tc>
+        <w:tc>
+          <w:tcPr>
+            <w:tcW w:type="dxa" w:w="536"/>
+            <w:tcMar>
+              <w:top w:type="dxa" w:w="60"/>
+              <w:left w:type="dxa" w:w="100"/>
+              <w:bottom w:type="dxa" w:w="60"/>
+              <w:right w:type="dxa" w:w="100"/>
+            </w:tcMar>
+          </w:tcPr>
+          <w:p>
+            <w:pPr>
+              <w:spacing w:after="20" w:before="20"/>
+            </w:pPr>
+          </w:p>
+        </w:tc>
+        <w:tc>
+          <w:tcPr>
+            <w:tcW w:type="dxa" w:w="536"/>
+            <w:tcMar>
+              <w:top w:type="dxa" w:w="60"/>
+              <w:left w:type="dxa" w:w="100"/>
+              <w:bottom w:type="dxa" w:w="60"/>
+              <w:right w:type="dxa" w:w="100"/>
+            </w:tcMar>
+          </w:tcPr>
+          <w:p>
+            <w:pPr>
+              <w:spacing w:after="20" w:before="20"/>
+            </w:pPr>
+          </w:p>
+        </w:tc>
+        <w:tc>
+          <w:tcPr>
+            <w:tcW w:type="dxa" w:w="536"/>
+            <w:tcMar>
+              <w:top w:type="dxa" w:w="60"/>
+              <w:left w:type="dxa" w:w="100"/>
+              <w:bottom w:type="dxa" w:w="60"/>
+              <w:right w:type="dxa" w:w="100"/>
+            </w:tcMar>
+          </w:tcPr>
+          <w:p>
+            <w:pPr>
+              <w:spacing w:after="20" w:before="20"/>
+            </w:pPr>
+          </w:p>
+        </w:tc>
+        <w:tc>
+          <w:tcPr>
+            <w:tcW w:type="dxa" w:w="536"/>
+            <w:tcMar>
+              <w:top w:type="dxa" w:w="60"/>
+              <w:left w:type="dxa" w:w="100"/>
+              <w:bottom w:type="dxa" w:w="60"/>
+              <w:right w:type="dxa" w:w="100"/>
+            </w:tcMar>
+          </w:tcPr>
+          <w:p>
+            <w:pPr>
+              <w:spacing w:after="20" w:before="20"/>
+            </w:pPr>
+          </w:p>
+        </w:tc>
+        <w:tc>
+          <w:tcPr>
+            <w:tcW w:type="dxa" w:w="536"/>
+            <w:tcMar>
+              <w:top w:type="dxa" w:w="60"/>
+              <w:left w:type="dxa" w:w="100"/>
+              <w:bottom w:type="dxa" w:w="60"/>
+              <w:right w:type="dxa" w:w="100"/>
+            </w:tcMar>
+          </w:tcPr>
+          <w:p>
+            <w:pPr>
+              <w:spacing w:after="20" w:before="20"/>
+            </w:pPr>
+          </w:p>
+        </w:tc>
+        <w:tc>
+          <w:tcPr>
+            <w:tcW w:type="dxa" w:w="536"/>
+            <w:tcMar>
+              <w:top w:type="dxa" w:w="60"/>
+              <w:left w:type="dxa" w:w="100"/>
+              <w:bottom w:type="dxa" w:w="60"/>
+              <w:right w:type="dxa" w:w="100"/>
+            </w:tcMar>
+          </w:tcPr>
+          <w:p>
+            <w:pPr>
+              <w:spacing w:after="20" w:before="20"/>
+            </w:pPr>
+          </w:p>
+        </w:tc>
+        <w:tc>
+          <w:tcPr>
+            <w:tcW w:type="dxa" w:w="536"/>
+            <w:tcMar>
+              <w:top w:type="dxa" w:w="60"/>
+              <w:left w:type="dxa" w:w="100"/>
+              <w:bottom w:type="dxa" w:w="60"/>
+              <w:right w:type="dxa" w:w="100"/>
+            </w:tcMar>
+          </w:tcPr>
+          <w:p>
+            <w:pPr>
+              <w:spacing w:after="20" w:before="20"/>
+            </w:pPr>
+          </w:p>
+        </w:tc>
+        <w:tc>
+          <w:tcPr>
+            <w:tcW w:type="dxa" w:w="536"/>
+            <w:tcMar>
+              <w:top w:type="dxa" w:w="60"/>
+              <w:left w:type="dxa" w:w="100"/>
+              <w:bottom w:type="dxa" w:w="60"/>
+              <w:right w:type="dxa" w:w="100"/>
+            </w:tcMar>
+          </w:tcPr>
+          <w:p>
+            <w:pPr>
+              <w:spacing w:after="20" w:before="20"/>
+            </w:pPr>
+          </w:p>
+        </w:tc>
+        <w:tc>
+          <w:tcPr>
+            <w:tcW w:type="dxa" w:w="536"/>
+            <w:tcMar>
+              <w:top w:type="dxa" w:w="60"/>
+              <w:left w:type="dxa" w:w="100"/>
+              <w:bottom w:type="dxa" w:w="60"/>
+              <w:right w:type="dxa" w:w="100"/>
+            </w:tcMar>
+          </w:tcPr>
+          <w:p>
+            <w:pPr>
+              <w:spacing w:after="20" w:before="20"/>
+            </w:pPr>
+            <w:r>
+              <w:t xml:space="preserve">██</w:t>
+            </w:r>
+          </w:p>
+        </w:tc>
+      </w:tr>
+    </w:tbl>
     <w:p>
       <w:pPr>
-        <w:spacing w:after="120"/>
-      </w:pPr>
-      <w:r>
-        <w:t xml:space="preserve">``</w:t>
-      </w:r>
-      <w:r>
-        <w:rPr>
-          <w:rFonts w:ascii="Consolas" w:cs="Consolas" w:eastAsia="Consolas" w:hAnsi="Consolas"/>
-          <w:sz w:val="19"/>
-          <w:szCs w:val="19"/>
-        </w:rPr>
-        <w:t xml:space="preserve"> Phase                                W1 W2 W3 W4 W5 W6 W7 W8 W9 W10 W11 W12 0  Discovery &amp; Setup                 ██ 1  Foundations                          ██ ██ 2  Tournament Setup &amp; Clock                ██ ██ ██ 3  Registration, Seating, Wallet                 ██ ██ ██ ██ 4  Payouts, Results &amp; Withdrawals                          ██ ██  ██ 5  Display &amp; iPad Polish                                       ██  ██ 6  Consumer-app Adaptors                                            ██ </w:t>
-      </w:r>
-      <w:r>
-        <w:t xml:space="preserve">``</w:t>
-      </w:r>
+        <w:spacing w:after="80"/>
+      </w:pPr>
     </w:p>
     <w:p>
       <w:pPr>
@@ -2436,24 +4291,1638 @@
         <w:t xml:space="preserve">Begins once the build phase is complete. Calendar pace depends on PlayLive's tournament schedule — bug-fix cycles and parallel-run tournaments cannot be artificially compressed.</w:t>
       </w:r>
     </w:p>
+    <w:tbl>
+      <w:tblPr>
+        <w:tblW w:type="dxa" w:w="9746"/>
+        <w:tblBorders>
+          <w:top w:val="single" w:color="C9C9C9" w:sz="4"/>
+          <w:left w:val="single" w:color="C9C9C9" w:sz="4"/>
+          <w:bottom w:val="single" w:color="C9C9C9" w:sz="4"/>
+          <w:right w:val="single" w:color="C9C9C9" w:sz="4"/>
+          <w:insideH w:val="single" w:color="C9C9C9" w:sz="4"/>
+          <w:insideV w:val="single" w:color="C9C9C9" w:sz="4"/>
+        </w:tblBorders>
+      </w:tblPr>
+      <w:tblGrid>
+        <w:gridCol w:w="3314"/>
+        <w:gridCol w:w="643"/>
+        <w:gridCol w:w="643"/>
+        <w:gridCol w:w="643"/>
+        <w:gridCol w:w="643"/>
+        <w:gridCol w:w="643"/>
+        <w:gridCol w:w="643"/>
+        <w:gridCol w:w="643"/>
+        <w:gridCol w:w="643"/>
+        <w:gridCol w:w="643"/>
+        <w:gridCol w:w="643"/>
+      </w:tblGrid>
+      <w:tr>
+        <w:trPr>
+          <w:tblHeader/>
+        </w:trPr>
+        <w:tc>
+          <w:tcPr>
+            <w:tcW w:type="dxa" w:w="3314"/>
+            <w:shd w:fill="EFEFEF" w:val="clear"/>
+            <w:tcMar>
+              <w:top w:type="dxa" w:w="60"/>
+              <w:left w:type="dxa" w:w="100"/>
+              <w:bottom w:type="dxa" w:w="60"/>
+              <w:right w:type="dxa" w:w="100"/>
+            </w:tcMar>
+          </w:tcPr>
+          <w:p>
+            <w:pPr>
+              <w:spacing w:after="20" w:before="20"/>
+            </w:pPr>
+            <w:r>
+              <w:rPr>
+                <w:b/>
+                <w:bCs/>
+              </w:rPr>
+              <w:t xml:space="preserve">Rollout activity</w:t>
+            </w:r>
+          </w:p>
+        </w:tc>
+        <w:tc>
+          <w:tcPr>
+            <w:tcW w:type="dxa" w:w="643"/>
+            <w:shd w:fill="EFEFEF" w:val="clear"/>
+            <w:tcMar>
+              <w:top w:type="dxa" w:w="60"/>
+              <w:left w:type="dxa" w:w="100"/>
+              <w:bottom w:type="dxa" w:w="60"/>
+              <w:right w:type="dxa" w:w="100"/>
+            </w:tcMar>
+          </w:tcPr>
+          <w:p>
+            <w:pPr>
+              <w:spacing w:after="20" w:before="20"/>
+            </w:pPr>
+            <w:r>
+              <w:rPr>
+                <w:b/>
+                <w:bCs/>
+              </w:rPr>
+              <w:t xml:space="preserve">R1</w:t>
+            </w:r>
+          </w:p>
+        </w:tc>
+        <w:tc>
+          <w:tcPr>
+            <w:tcW w:type="dxa" w:w="643"/>
+            <w:shd w:fill="EFEFEF" w:val="clear"/>
+            <w:tcMar>
+              <w:top w:type="dxa" w:w="60"/>
+              <w:left w:type="dxa" w:w="100"/>
+              <w:bottom w:type="dxa" w:w="60"/>
+              <w:right w:type="dxa" w:w="100"/>
+            </w:tcMar>
+          </w:tcPr>
+          <w:p>
+            <w:pPr>
+              <w:spacing w:after="20" w:before="20"/>
+            </w:pPr>
+            <w:r>
+              <w:rPr>
+                <w:b/>
+                <w:bCs/>
+              </w:rPr>
+              <w:t xml:space="preserve">R2</w:t>
+            </w:r>
+          </w:p>
+        </w:tc>
+        <w:tc>
+          <w:tcPr>
+            <w:tcW w:type="dxa" w:w="643"/>
+            <w:shd w:fill="EFEFEF" w:val="clear"/>
+            <w:tcMar>
+              <w:top w:type="dxa" w:w="60"/>
+              <w:left w:type="dxa" w:w="100"/>
+              <w:bottom w:type="dxa" w:w="60"/>
+              <w:right w:type="dxa" w:w="100"/>
+            </w:tcMar>
+          </w:tcPr>
+          <w:p>
+            <w:pPr>
+              <w:spacing w:after="20" w:before="20"/>
+            </w:pPr>
+            <w:r>
+              <w:rPr>
+                <w:b/>
+                <w:bCs/>
+              </w:rPr>
+              <w:t xml:space="preserve">R3</w:t>
+            </w:r>
+          </w:p>
+        </w:tc>
+        <w:tc>
+          <w:tcPr>
+            <w:tcW w:type="dxa" w:w="643"/>
+            <w:shd w:fill="EFEFEF" w:val="clear"/>
+            <w:tcMar>
+              <w:top w:type="dxa" w:w="60"/>
+              <w:left w:type="dxa" w:w="100"/>
+              <w:bottom w:type="dxa" w:w="60"/>
+              <w:right w:type="dxa" w:w="100"/>
+            </w:tcMar>
+          </w:tcPr>
+          <w:p>
+            <w:pPr>
+              <w:spacing w:after="20" w:before="20"/>
+            </w:pPr>
+            <w:r>
+              <w:rPr>
+                <w:b/>
+                <w:bCs/>
+              </w:rPr>
+              <w:t xml:space="preserve">R4</w:t>
+            </w:r>
+          </w:p>
+        </w:tc>
+        <w:tc>
+          <w:tcPr>
+            <w:tcW w:type="dxa" w:w="643"/>
+            <w:shd w:fill="EFEFEF" w:val="clear"/>
+            <w:tcMar>
+              <w:top w:type="dxa" w:w="60"/>
+              <w:left w:type="dxa" w:w="100"/>
+              <w:bottom w:type="dxa" w:w="60"/>
+              <w:right w:type="dxa" w:w="100"/>
+            </w:tcMar>
+          </w:tcPr>
+          <w:p>
+            <w:pPr>
+              <w:spacing w:after="20" w:before="20"/>
+            </w:pPr>
+            <w:r>
+              <w:rPr>
+                <w:b/>
+                <w:bCs/>
+              </w:rPr>
+              <w:t xml:space="preserve">R5</w:t>
+            </w:r>
+          </w:p>
+        </w:tc>
+        <w:tc>
+          <w:tcPr>
+            <w:tcW w:type="dxa" w:w="643"/>
+            <w:shd w:fill="EFEFEF" w:val="clear"/>
+            <w:tcMar>
+              <w:top w:type="dxa" w:w="60"/>
+              <w:left w:type="dxa" w:w="100"/>
+              <w:bottom w:type="dxa" w:w="60"/>
+              <w:right w:type="dxa" w:w="100"/>
+            </w:tcMar>
+          </w:tcPr>
+          <w:p>
+            <w:pPr>
+              <w:spacing w:after="20" w:before="20"/>
+            </w:pPr>
+            <w:r>
+              <w:rPr>
+                <w:b/>
+                <w:bCs/>
+              </w:rPr>
+              <w:t xml:space="preserve">R6</w:t>
+            </w:r>
+          </w:p>
+        </w:tc>
+        <w:tc>
+          <w:tcPr>
+            <w:tcW w:type="dxa" w:w="643"/>
+            <w:shd w:fill="EFEFEF" w:val="clear"/>
+            <w:tcMar>
+              <w:top w:type="dxa" w:w="60"/>
+              <w:left w:type="dxa" w:w="100"/>
+              <w:bottom w:type="dxa" w:w="60"/>
+              <w:right w:type="dxa" w:w="100"/>
+            </w:tcMar>
+          </w:tcPr>
+          <w:p>
+            <w:pPr>
+              <w:spacing w:after="20" w:before="20"/>
+            </w:pPr>
+            <w:r>
+              <w:rPr>
+                <w:b/>
+                <w:bCs/>
+              </w:rPr>
+              <w:t xml:space="preserve">R7</w:t>
+            </w:r>
+          </w:p>
+        </w:tc>
+        <w:tc>
+          <w:tcPr>
+            <w:tcW w:type="dxa" w:w="643"/>
+            <w:shd w:fill="EFEFEF" w:val="clear"/>
+            <w:tcMar>
+              <w:top w:type="dxa" w:w="60"/>
+              <w:left w:type="dxa" w:w="100"/>
+              <w:bottom w:type="dxa" w:w="60"/>
+              <w:right w:type="dxa" w:w="100"/>
+            </w:tcMar>
+          </w:tcPr>
+          <w:p>
+            <w:pPr>
+              <w:spacing w:after="20" w:before="20"/>
+            </w:pPr>
+            <w:r>
+              <w:rPr>
+                <w:b/>
+                <w:bCs/>
+              </w:rPr>
+              <w:t xml:space="preserve">R8</w:t>
+            </w:r>
+          </w:p>
+        </w:tc>
+        <w:tc>
+          <w:tcPr>
+            <w:tcW w:type="dxa" w:w="643"/>
+            <w:shd w:fill="EFEFEF" w:val="clear"/>
+            <w:tcMar>
+              <w:top w:type="dxa" w:w="60"/>
+              <w:left w:type="dxa" w:w="100"/>
+              <w:bottom w:type="dxa" w:w="60"/>
+              <w:right w:type="dxa" w:w="100"/>
+            </w:tcMar>
+          </w:tcPr>
+          <w:p>
+            <w:pPr>
+              <w:spacing w:after="20" w:before="20"/>
+            </w:pPr>
+            <w:r>
+              <w:rPr>
+                <w:b/>
+                <w:bCs/>
+              </w:rPr>
+              <w:t xml:space="preserve">R9</w:t>
+            </w:r>
+          </w:p>
+        </w:tc>
+        <w:tc>
+          <w:tcPr>
+            <w:tcW w:type="dxa" w:w="643"/>
+            <w:shd w:fill="EFEFEF" w:val="clear"/>
+            <w:tcMar>
+              <w:top w:type="dxa" w:w="60"/>
+              <w:left w:type="dxa" w:w="100"/>
+              <w:bottom w:type="dxa" w:w="60"/>
+              <w:right w:type="dxa" w:w="100"/>
+            </w:tcMar>
+          </w:tcPr>
+          <w:p>
+            <w:pPr>
+              <w:spacing w:after="20" w:before="20"/>
+            </w:pPr>
+            <w:r>
+              <w:rPr>
+                <w:b/>
+                <w:bCs/>
+              </w:rPr>
+              <w:t xml:space="preserve">R10</w:t>
+            </w:r>
+          </w:p>
+        </w:tc>
+      </w:tr>
+      <w:tr>
+        <w:trPr>
+          <w:tblHeader w:val="false"/>
+        </w:trPr>
+        <w:tc>
+          <w:tcPr>
+            <w:tcW w:type="dxa" w:w="3314"/>
+            <w:tcMar>
+              <w:top w:type="dxa" w:w="60"/>
+              <w:left w:type="dxa" w:w="100"/>
+              <w:bottom w:type="dxa" w:w="60"/>
+              <w:right w:type="dxa" w:w="100"/>
+            </w:tcMar>
+          </w:tcPr>
+          <w:p>
+            <w:pPr>
+              <w:spacing w:after="20" w:before="20"/>
+            </w:pPr>
+            <w:r>
+              <w:t xml:space="preserve">Handbook + champion training</w:t>
+            </w:r>
+          </w:p>
+        </w:tc>
+        <w:tc>
+          <w:tcPr>
+            <w:tcW w:type="dxa" w:w="643"/>
+            <w:tcMar>
+              <w:top w:type="dxa" w:w="60"/>
+              <w:left w:type="dxa" w:w="100"/>
+              <w:bottom w:type="dxa" w:w="60"/>
+              <w:right w:type="dxa" w:w="100"/>
+            </w:tcMar>
+          </w:tcPr>
+          <w:p>
+            <w:pPr>
+              <w:spacing w:after="20" w:before="20"/>
+            </w:pPr>
+            <w:r>
+              <w:t xml:space="preserve">██</w:t>
+            </w:r>
+          </w:p>
+        </w:tc>
+        <w:tc>
+          <w:tcPr>
+            <w:tcW w:type="dxa" w:w="643"/>
+            <w:tcMar>
+              <w:top w:type="dxa" w:w="60"/>
+              <w:left w:type="dxa" w:w="100"/>
+              <w:bottom w:type="dxa" w:w="60"/>
+              <w:right w:type="dxa" w:w="100"/>
+            </w:tcMar>
+          </w:tcPr>
+          <w:p>
+            <w:pPr>
+              <w:spacing w:after="20" w:before="20"/>
+            </w:pPr>
+            <w:r>
+              <w:t xml:space="preserve">██</w:t>
+            </w:r>
+          </w:p>
+        </w:tc>
+        <w:tc>
+          <w:tcPr>
+            <w:tcW w:type="dxa" w:w="643"/>
+            <w:tcMar>
+              <w:top w:type="dxa" w:w="60"/>
+              <w:left w:type="dxa" w:w="100"/>
+              <w:bottom w:type="dxa" w:w="60"/>
+              <w:right w:type="dxa" w:w="100"/>
+            </w:tcMar>
+          </w:tcPr>
+          <w:p>
+            <w:pPr>
+              <w:spacing w:after="20" w:before="20"/>
+            </w:pPr>
+          </w:p>
+        </w:tc>
+        <w:tc>
+          <w:tcPr>
+            <w:tcW w:type="dxa" w:w="643"/>
+            <w:tcMar>
+              <w:top w:type="dxa" w:w="60"/>
+              <w:left w:type="dxa" w:w="100"/>
+              <w:bottom w:type="dxa" w:w="60"/>
+              <w:right w:type="dxa" w:w="100"/>
+            </w:tcMar>
+          </w:tcPr>
+          <w:p>
+            <w:pPr>
+              <w:spacing w:after="20" w:before="20"/>
+            </w:pPr>
+          </w:p>
+        </w:tc>
+        <w:tc>
+          <w:tcPr>
+            <w:tcW w:type="dxa" w:w="643"/>
+            <w:tcMar>
+              <w:top w:type="dxa" w:w="60"/>
+              <w:left w:type="dxa" w:w="100"/>
+              <w:bottom w:type="dxa" w:w="60"/>
+              <w:right w:type="dxa" w:w="100"/>
+            </w:tcMar>
+          </w:tcPr>
+          <w:p>
+            <w:pPr>
+              <w:spacing w:after="20" w:before="20"/>
+            </w:pPr>
+          </w:p>
+        </w:tc>
+        <w:tc>
+          <w:tcPr>
+            <w:tcW w:type="dxa" w:w="643"/>
+            <w:tcMar>
+              <w:top w:type="dxa" w:w="60"/>
+              <w:left w:type="dxa" w:w="100"/>
+              <w:bottom w:type="dxa" w:w="60"/>
+              <w:right w:type="dxa" w:w="100"/>
+            </w:tcMar>
+          </w:tcPr>
+          <w:p>
+            <w:pPr>
+              <w:spacing w:after="20" w:before="20"/>
+            </w:pPr>
+          </w:p>
+        </w:tc>
+        <w:tc>
+          <w:tcPr>
+            <w:tcW w:type="dxa" w:w="643"/>
+            <w:tcMar>
+              <w:top w:type="dxa" w:w="60"/>
+              <w:left w:type="dxa" w:w="100"/>
+              <w:bottom w:type="dxa" w:w="60"/>
+              <w:right w:type="dxa" w:w="100"/>
+            </w:tcMar>
+          </w:tcPr>
+          <w:p>
+            <w:pPr>
+              <w:spacing w:after="20" w:before="20"/>
+            </w:pPr>
+          </w:p>
+        </w:tc>
+        <w:tc>
+          <w:tcPr>
+            <w:tcW w:type="dxa" w:w="643"/>
+            <w:tcMar>
+              <w:top w:type="dxa" w:w="60"/>
+              <w:left w:type="dxa" w:w="100"/>
+              <w:bottom w:type="dxa" w:w="60"/>
+              <w:right w:type="dxa" w:w="100"/>
+            </w:tcMar>
+          </w:tcPr>
+          <w:p>
+            <w:pPr>
+              <w:spacing w:after="20" w:before="20"/>
+            </w:pPr>
+          </w:p>
+        </w:tc>
+        <w:tc>
+          <w:tcPr>
+            <w:tcW w:type="dxa" w:w="643"/>
+            <w:tcMar>
+              <w:top w:type="dxa" w:w="60"/>
+              <w:left w:type="dxa" w:w="100"/>
+              <w:bottom w:type="dxa" w:w="60"/>
+              <w:right w:type="dxa" w:w="100"/>
+            </w:tcMar>
+          </w:tcPr>
+          <w:p>
+            <w:pPr>
+              <w:spacing w:after="20" w:before="20"/>
+            </w:pPr>
+          </w:p>
+        </w:tc>
+        <w:tc>
+          <w:tcPr>
+            <w:tcW w:type="dxa" w:w="643"/>
+            <w:tcMar>
+              <w:top w:type="dxa" w:w="60"/>
+              <w:left w:type="dxa" w:w="100"/>
+              <w:bottom w:type="dxa" w:w="60"/>
+              <w:right w:type="dxa" w:w="100"/>
+            </w:tcMar>
+          </w:tcPr>
+          <w:p>
+            <w:pPr>
+              <w:spacing w:after="20" w:before="20"/>
+            </w:pPr>
+          </w:p>
+        </w:tc>
+      </w:tr>
+      <w:tr>
+        <w:trPr>
+          <w:tblHeader w:val="false"/>
+        </w:trPr>
+        <w:tc>
+          <w:tcPr>
+            <w:tcW w:type="dxa" w:w="3314"/>
+            <w:tcMar>
+              <w:top w:type="dxa" w:w="60"/>
+              <w:left w:type="dxa" w:w="100"/>
+              <w:bottom w:type="dxa" w:w="60"/>
+              <w:right w:type="dxa" w:w="100"/>
+            </w:tcMar>
+          </w:tcPr>
+          <w:p>
+            <w:pPr>
+              <w:spacing w:after="20" w:before="20"/>
+            </w:pPr>
+            <w:r>
+              <w:t xml:space="preserve">Group training</w:t>
+            </w:r>
+          </w:p>
+        </w:tc>
+        <w:tc>
+          <w:tcPr>
+            <w:tcW w:type="dxa" w:w="643"/>
+            <w:tcMar>
+              <w:top w:type="dxa" w:w="60"/>
+              <w:left w:type="dxa" w:w="100"/>
+              <w:bottom w:type="dxa" w:w="60"/>
+              <w:right w:type="dxa" w:w="100"/>
+            </w:tcMar>
+          </w:tcPr>
+          <w:p>
+            <w:pPr>
+              <w:spacing w:after="20" w:before="20"/>
+            </w:pPr>
+          </w:p>
+        </w:tc>
+        <w:tc>
+          <w:tcPr>
+            <w:tcW w:type="dxa" w:w="643"/>
+            <w:tcMar>
+              <w:top w:type="dxa" w:w="60"/>
+              <w:left w:type="dxa" w:w="100"/>
+              <w:bottom w:type="dxa" w:w="60"/>
+              <w:right w:type="dxa" w:w="100"/>
+            </w:tcMar>
+          </w:tcPr>
+          <w:p>
+            <w:pPr>
+              <w:spacing w:after="20" w:before="20"/>
+            </w:pPr>
+            <w:r>
+              <w:t xml:space="preserve">██</w:t>
+            </w:r>
+          </w:p>
+        </w:tc>
+        <w:tc>
+          <w:tcPr>
+            <w:tcW w:type="dxa" w:w="643"/>
+            <w:tcMar>
+              <w:top w:type="dxa" w:w="60"/>
+              <w:left w:type="dxa" w:w="100"/>
+              <w:bottom w:type="dxa" w:w="60"/>
+              <w:right w:type="dxa" w:w="100"/>
+            </w:tcMar>
+          </w:tcPr>
+          <w:p>
+            <w:pPr>
+              <w:spacing w:after="20" w:before="20"/>
+            </w:pPr>
+          </w:p>
+        </w:tc>
+        <w:tc>
+          <w:tcPr>
+            <w:tcW w:type="dxa" w:w="643"/>
+            <w:tcMar>
+              <w:top w:type="dxa" w:w="60"/>
+              <w:left w:type="dxa" w:w="100"/>
+              <w:bottom w:type="dxa" w:w="60"/>
+              <w:right w:type="dxa" w:w="100"/>
+            </w:tcMar>
+          </w:tcPr>
+          <w:p>
+            <w:pPr>
+              <w:spacing w:after="20" w:before="20"/>
+            </w:pPr>
+          </w:p>
+        </w:tc>
+        <w:tc>
+          <w:tcPr>
+            <w:tcW w:type="dxa" w:w="643"/>
+            <w:tcMar>
+              <w:top w:type="dxa" w:w="60"/>
+              <w:left w:type="dxa" w:w="100"/>
+              <w:bottom w:type="dxa" w:w="60"/>
+              <w:right w:type="dxa" w:w="100"/>
+            </w:tcMar>
+          </w:tcPr>
+          <w:p>
+            <w:pPr>
+              <w:spacing w:after="20" w:before="20"/>
+            </w:pPr>
+          </w:p>
+        </w:tc>
+        <w:tc>
+          <w:tcPr>
+            <w:tcW w:type="dxa" w:w="643"/>
+            <w:tcMar>
+              <w:top w:type="dxa" w:w="60"/>
+              <w:left w:type="dxa" w:w="100"/>
+              <w:bottom w:type="dxa" w:w="60"/>
+              <w:right w:type="dxa" w:w="100"/>
+            </w:tcMar>
+          </w:tcPr>
+          <w:p>
+            <w:pPr>
+              <w:spacing w:after="20" w:before="20"/>
+            </w:pPr>
+          </w:p>
+        </w:tc>
+        <w:tc>
+          <w:tcPr>
+            <w:tcW w:type="dxa" w:w="643"/>
+            <w:tcMar>
+              <w:top w:type="dxa" w:w="60"/>
+              <w:left w:type="dxa" w:w="100"/>
+              <w:bottom w:type="dxa" w:w="60"/>
+              <w:right w:type="dxa" w:w="100"/>
+            </w:tcMar>
+          </w:tcPr>
+          <w:p>
+            <w:pPr>
+              <w:spacing w:after="20" w:before="20"/>
+            </w:pPr>
+          </w:p>
+        </w:tc>
+        <w:tc>
+          <w:tcPr>
+            <w:tcW w:type="dxa" w:w="643"/>
+            <w:tcMar>
+              <w:top w:type="dxa" w:w="60"/>
+              <w:left w:type="dxa" w:w="100"/>
+              <w:bottom w:type="dxa" w:w="60"/>
+              <w:right w:type="dxa" w:w="100"/>
+            </w:tcMar>
+          </w:tcPr>
+          <w:p>
+            <w:pPr>
+              <w:spacing w:after="20" w:before="20"/>
+            </w:pPr>
+          </w:p>
+        </w:tc>
+        <w:tc>
+          <w:tcPr>
+            <w:tcW w:type="dxa" w:w="643"/>
+            <w:tcMar>
+              <w:top w:type="dxa" w:w="60"/>
+              <w:left w:type="dxa" w:w="100"/>
+              <w:bottom w:type="dxa" w:w="60"/>
+              <w:right w:type="dxa" w:w="100"/>
+            </w:tcMar>
+          </w:tcPr>
+          <w:p>
+            <w:pPr>
+              <w:spacing w:after="20" w:before="20"/>
+            </w:pPr>
+          </w:p>
+        </w:tc>
+        <w:tc>
+          <w:tcPr>
+            <w:tcW w:type="dxa" w:w="643"/>
+            <w:tcMar>
+              <w:top w:type="dxa" w:w="60"/>
+              <w:left w:type="dxa" w:w="100"/>
+              <w:bottom w:type="dxa" w:w="60"/>
+              <w:right w:type="dxa" w:w="100"/>
+            </w:tcMar>
+          </w:tcPr>
+          <w:p>
+            <w:pPr>
+              <w:spacing w:after="20" w:before="20"/>
+            </w:pPr>
+          </w:p>
+        </w:tc>
+      </w:tr>
+      <w:tr>
+        <w:trPr>
+          <w:tblHeader w:val="false"/>
+        </w:trPr>
+        <w:tc>
+          <w:tcPr>
+            <w:tcW w:type="dxa" w:w="3314"/>
+            <w:tcMar>
+              <w:top w:type="dxa" w:w="60"/>
+              <w:left w:type="dxa" w:w="100"/>
+              <w:bottom w:type="dxa" w:w="60"/>
+              <w:right w:type="dxa" w:w="100"/>
+            </w:tcMar>
+          </w:tcPr>
+          <w:p>
+            <w:pPr>
+              <w:spacing w:after="20" w:before="20"/>
+            </w:pPr>
+            <w:r>
+              <w:t xml:space="preserve">Tournaments 1–2 (parallel run)</w:t>
+            </w:r>
+          </w:p>
+        </w:tc>
+        <w:tc>
+          <w:tcPr>
+            <w:tcW w:type="dxa" w:w="643"/>
+            <w:tcMar>
+              <w:top w:type="dxa" w:w="60"/>
+              <w:left w:type="dxa" w:w="100"/>
+              <w:bottom w:type="dxa" w:w="60"/>
+              <w:right w:type="dxa" w:w="100"/>
+            </w:tcMar>
+          </w:tcPr>
+          <w:p>
+            <w:pPr>
+              <w:spacing w:after="20" w:before="20"/>
+            </w:pPr>
+          </w:p>
+        </w:tc>
+        <w:tc>
+          <w:tcPr>
+            <w:tcW w:type="dxa" w:w="643"/>
+            <w:tcMar>
+              <w:top w:type="dxa" w:w="60"/>
+              <w:left w:type="dxa" w:w="100"/>
+              <w:bottom w:type="dxa" w:w="60"/>
+              <w:right w:type="dxa" w:w="100"/>
+            </w:tcMar>
+          </w:tcPr>
+          <w:p>
+            <w:pPr>
+              <w:spacing w:after="20" w:before="20"/>
+            </w:pPr>
+          </w:p>
+        </w:tc>
+        <w:tc>
+          <w:tcPr>
+            <w:tcW w:type="dxa" w:w="643"/>
+            <w:tcMar>
+              <w:top w:type="dxa" w:w="60"/>
+              <w:left w:type="dxa" w:w="100"/>
+              <w:bottom w:type="dxa" w:w="60"/>
+              <w:right w:type="dxa" w:w="100"/>
+            </w:tcMar>
+          </w:tcPr>
+          <w:p>
+            <w:pPr>
+              <w:spacing w:after="20" w:before="20"/>
+            </w:pPr>
+            <w:r>
+              <w:t xml:space="preserve">██</w:t>
+            </w:r>
+          </w:p>
+        </w:tc>
+        <w:tc>
+          <w:tcPr>
+            <w:tcW w:type="dxa" w:w="643"/>
+            <w:tcMar>
+              <w:top w:type="dxa" w:w="60"/>
+              <w:left w:type="dxa" w:w="100"/>
+              <w:bottom w:type="dxa" w:w="60"/>
+              <w:right w:type="dxa" w:w="100"/>
+            </w:tcMar>
+          </w:tcPr>
+          <w:p>
+            <w:pPr>
+              <w:spacing w:after="20" w:before="20"/>
+            </w:pPr>
+            <w:r>
+              <w:t xml:space="preserve">██</w:t>
+            </w:r>
+          </w:p>
+        </w:tc>
+        <w:tc>
+          <w:tcPr>
+            <w:tcW w:type="dxa" w:w="643"/>
+            <w:tcMar>
+              <w:top w:type="dxa" w:w="60"/>
+              <w:left w:type="dxa" w:w="100"/>
+              <w:bottom w:type="dxa" w:w="60"/>
+              <w:right w:type="dxa" w:w="100"/>
+            </w:tcMar>
+          </w:tcPr>
+          <w:p>
+            <w:pPr>
+              <w:spacing w:after="20" w:before="20"/>
+            </w:pPr>
+          </w:p>
+        </w:tc>
+        <w:tc>
+          <w:tcPr>
+            <w:tcW w:type="dxa" w:w="643"/>
+            <w:tcMar>
+              <w:top w:type="dxa" w:w="60"/>
+              <w:left w:type="dxa" w:w="100"/>
+              <w:bottom w:type="dxa" w:w="60"/>
+              <w:right w:type="dxa" w:w="100"/>
+            </w:tcMar>
+          </w:tcPr>
+          <w:p>
+            <w:pPr>
+              <w:spacing w:after="20" w:before="20"/>
+            </w:pPr>
+          </w:p>
+        </w:tc>
+        <w:tc>
+          <w:tcPr>
+            <w:tcW w:type="dxa" w:w="643"/>
+            <w:tcMar>
+              <w:top w:type="dxa" w:w="60"/>
+              <w:left w:type="dxa" w:w="100"/>
+              <w:bottom w:type="dxa" w:w="60"/>
+              <w:right w:type="dxa" w:w="100"/>
+            </w:tcMar>
+          </w:tcPr>
+          <w:p>
+            <w:pPr>
+              <w:spacing w:after="20" w:before="20"/>
+            </w:pPr>
+          </w:p>
+        </w:tc>
+        <w:tc>
+          <w:tcPr>
+            <w:tcW w:type="dxa" w:w="643"/>
+            <w:tcMar>
+              <w:top w:type="dxa" w:w="60"/>
+              <w:left w:type="dxa" w:w="100"/>
+              <w:bottom w:type="dxa" w:w="60"/>
+              <w:right w:type="dxa" w:w="100"/>
+            </w:tcMar>
+          </w:tcPr>
+          <w:p>
+            <w:pPr>
+              <w:spacing w:after="20" w:before="20"/>
+            </w:pPr>
+          </w:p>
+        </w:tc>
+        <w:tc>
+          <w:tcPr>
+            <w:tcW w:type="dxa" w:w="643"/>
+            <w:tcMar>
+              <w:top w:type="dxa" w:w="60"/>
+              <w:left w:type="dxa" w:w="100"/>
+              <w:bottom w:type="dxa" w:w="60"/>
+              <w:right w:type="dxa" w:w="100"/>
+            </w:tcMar>
+          </w:tcPr>
+          <w:p>
+            <w:pPr>
+              <w:spacing w:after="20" w:before="20"/>
+            </w:pPr>
+          </w:p>
+        </w:tc>
+        <w:tc>
+          <w:tcPr>
+            <w:tcW w:type="dxa" w:w="643"/>
+            <w:tcMar>
+              <w:top w:type="dxa" w:w="60"/>
+              <w:left w:type="dxa" w:w="100"/>
+              <w:bottom w:type="dxa" w:w="60"/>
+              <w:right w:type="dxa" w:w="100"/>
+            </w:tcMar>
+          </w:tcPr>
+          <w:p>
+            <w:pPr>
+              <w:spacing w:after="20" w:before="20"/>
+            </w:pPr>
+          </w:p>
+        </w:tc>
+      </w:tr>
+      <w:tr>
+        <w:trPr>
+          <w:tblHeader w:val="false"/>
+        </w:trPr>
+        <w:tc>
+          <w:tcPr>
+            <w:tcW w:type="dxa" w:w="3314"/>
+            <w:tcMar>
+              <w:top w:type="dxa" w:w="60"/>
+              <w:left w:type="dxa" w:w="100"/>
+              <w:bottom w:type="dxa" w:w="60"/>
+              <w:right w:type="dxa" w:w="100"/>
+            </w:tcMar>
+          </w:tcPr>
+          <w:p>
+            <w:pPr>
+              <w:spacing w:after="20" w:before="20"/>
+            </w:pPr>
+            <w:r>
+              <w:t xml:space="preserve">Bug-fix sprint</w:t>
+            </w:r>
+          </w:p>
+        </w:tc>
+        <w:tc>
+          <w:tcPr>
+            <w:tcW w:type="dxa" w:w="643"/>
+            <w:tcMar>
+              <w:top w:type="dxa" w:w="60"/>
+              <w:left w:type="dxa" w:w="100"/>
+              <w:bottom w:type="dxa" w:w="60"/>
+              <w:right w:type="dxa" w:w="100"/>
+            </w:tcMar>
+          </w:tcPr>
+          <w:p>
+            <w:pPr>
+              <w:spacing w:after="20" w:before="20"/>
+            </w:pPr>
+          </w:p>
+        </w:tc>
+        <w:tc>
+          <w:tcPr>
+            <w:tcW w:type="dxa" w:w="643"/>
+            <w:tcMar>
+              <w:top w:type="dxa" w:w="60"/>
+              <w:left w:type="dxa" w:w="100"/>
+              <w:bottom w:type="dxa" w:w="60"/>
+              <w:right w:type="dxa" w:w="100"/>
+            </w:tcMar>
+          </w:tcPr>
+          <w:p>
+            <w:pPr>
+              <w:spacing w:after="20" w:before="20"/>
+            </w:pPr>
+          </w:p>
+        </w:tc>
+        <w:tc>
+          <w:tcPr>
+            <w:tcW w:type="dxa" w:w="643"/>
+            <w:tcMar>
+              <w:top w:type="dxa" w:w="60"/>
+              <w:left w:type="dxa" w:w="100"/>
+              <w:bottom w:type="dxa" w:w="60"/>
+              <w:right w:type="dxa" w:w="100"/>
+            </w:tcMar>
+          </w:tcPr>
+          <w:p>
+            <w:pPr>
+              <w:spacing w:after="20" w:before="20"/>
+            </w:pPr>
+          </w:p>
+        </w:tc>
+        <w:tc>
+          <w:tcPr>
+            <w:tcW w:type="dxa" w:w="643"/>
+            <w:tcMar>
+              <w:top w:type="dxa" w:w="60"/>
+              <w:left w:type="dxa" w:w="100"/>
+              <w:bottom w:type="dxa" w:w="60"/>
+              <w:right w:type="dxa" w:w="100"/>
+            </w:tcMar>
+          </w:tcPr>
+          <w:p>
+            <w:pPr>
+              <w:spacing w:after="20" w:before="20"/>
+            </w:pPr>
+            <w:r>
+              <w:t xml:space="preserve">██</w:t>
+            </w:r>
+          </w:p>
+        </w:tc>
+        <w:tc>
+          <w:tcPr>
+            <w:tcW w:type="dxa" w:w="643"/>
+            <w:tcMar>
+              <w:top w:type="dxa" w:w="60"/>
+              <w:left w:type="dxa" w:w="100"/>
+              <w:bottom w:type="dxa" w:w="60"/>
+              <w:right w:type="dxa" w:w="100"/>
+            </w:tcMar>
+          </w:tcPr>
+          <w:p>
+            <w:pPr>
+              <w:spacing w:after="20" w:before="20"/>
+            </w:pPr>
+            <w:r>
+              <w:t xml:space="preserve">██</w:t>
+            </w:r>
+          </w:p>
+        </w:tc>
+        <w:tc>
+          <w:tcPr>
+            <w:tcW w:type="dxa" w:w="643"/>
+            <w:tcMar>
+              <w:top w:type="dxa" w:w="60"/>
+              <w:left w:type="dxa" w:w="100"/>
+              <w:bottom w:type="dxa" w:w="60"/>
+              <w:right w:type="dxa" w:w="100"/>
+            </w:tcMar>
+          </w:tcPr>
+          <w:p>
+            <w:pPr>
+              <w:spacing w:after="20" w:before="20"/>
+            </w:pPr>
+          </w:p>
+        </w:tc>
+        <w:tc>
+          <w:tcPr>
+            <w:tcW w:type="dxa" w:w="643"/>
+            <w:tcMar>
+              <w:top w:type="dxa" w:w="60"/>
+              <w:left w:type="dxa" w:w="100"/>
+              <w:bottom w:type="dxa" w:w="60"/>
+              <w:right w:type="dxa" w:w="100"/>
+            </w:tcMar>
+          </w:tcPr>
+          <w:p>
+            <w:pPr>
+              <w:spacing w:after="20" w:before="20"/>
+            </w:pPr>
+          </w:p>
+        </w:tc>
+        <w:tc>
+          <w:tcPr>
+            <w:tcW w:type="dxa" w:w="643"/>
+            <w:tcMar>
+              <w:top w:type="dxa" w:w="60"/>
+              <w:left w:type="dxa" w:w="100"/>
+              <w:bottom w:type="dxa" w:w="60"/>
+              <w:right w:type="dxa" w:w="100"/>
+            </w:tcMar>
+          </w:tcPr>
+          <w:p>
+            <w:pPr>
+              <w:spacing w:after="20" w:before="20"/>
+            </w:pPr>
+          </w:p>
+        </w:tc>
+        <w:tc>
+          <w:tcPr>
+            <w:tcW w:type="dxa" w:w="643"/>
+            <w:tcMar>
+              <w:top w:type="dxa" w:w="60"/>
+              <w:left w:type="dxa" w:w="100"/>
+              <w:bottom w:type="dxa" w:w="60"/>
+              <w:right w:type="dxa" w:w="100"/>
+            </w:tcMar>
+          </w:tcPr>
+          <w:p>
+            <w:pPr>
+              <w:spacing w:after="20" w:before="20"/>
+            </w:pPr>
+          </w:p>
+        </w:tc>
+        <w:tc>
+          <w:tcPr>
+            <w:tcW w:type="dxa" w:w="643"/>
+            <w:tcMar>
+              <w:top w:type="dxa" w:w="60"/>
+              <w:left w:type="dxa" w:w="100"/>
+              <w:bottom w:type="dxa" w:w="60"/>
+              <w:right w:type="dxa" w:w="100"/>
+            </w:tcMar>
+          </w:tcPr>
+          <w:p>
+            <w:pPr>
+              <w:spacing w:after="20" w:before="20"/>
+            </w:pPr>
+          </w:p>
+        </w:tc>
+      </w:tr>
+      <w:tr>
+        <w:trPr>
+          <w:tblHeader w:val="false"/>
+        </w:trPr>
+        <w:tc>
+          <w:tcPr>
+            <w:tcW w:type="dxa" w:w="3314"/>
+            <w:tcMar>
+              <w:top w:type="dxa" w:w="60"/>
+              <w:left w:type="dxa" w:w="100"/>
+              <w:bottom w:type="dxa" w:w="60"/>
+              <w:right w:type="dxa" w:w="100"/>
+            </w:tcMar>
+          </w:tcPr>
+          <w:p>
+            <w:pPr>
+              <w:spacing w:after="20" w:before="20"/>
+            </w:pPr>
+            <w:r>
+              <w:t xml:space="preserve">Tournaments 3–5 + reconciliation</w:t>
+            </w:r>
+          </w:p>
+        </w:tc>
+        <w:tc>
+          <w:tcPr>
+            <w:tcW w:type="dxa" w:w="643"/>
+            <w:tcMar>
+              <w:top w:type="dxa" w:w="60"/>
+              <w:left w:type="dxa" w:w="100"/>
+              <w:bottom w:type="dxa" w:w="60"/>
+              <w:right w:type="dxa" w:w="100"/>
+            </w:tcMar>
+          </w:tcPr>
+          <w:p>
+            <w:pPr>
+              <w:spacing w:after="20" w:before="20"/>
+            </w:pPr>
+          </w:p>
+        </w:tc>
+        <w:tc>
+          <w:tcPr>
+            <w:tcW w:type="dxa" w:w="643"/>
+            <w:tcMar>
+              <w:top w:type="dxa" w:w="60"/>
+              <w:left w:type="dxa" w:w="100"/>
+              <w:bottom w:type="dxa" w:w="60"/>
+              <w:right w:type="dxa" w:w="100"/>
+            </w:tcMar>
+          </w:tcPr>
+          <w:p>
+            <w:pPr>
+              <w:spacing w:after="20" w:before="20"/>
+            </w:pPr>
+          </w:p>
+        </w:tc>
+        <w:tc>
+          <w:tcPr>
+            <w:tcW w:type="dxa" w:w="643"/>
+            <w:tcMar>
+              <w:top w:type="dxa" w:w="60"/>
+              <w:left w:type="dxa" w:w="100"/>
+              <w:bottom w:type="dxa" w:w="60"/>
+              <w:right w:type="dxa" w:w="100"/>
+            </w:tcMar>
+          </w:tcPr>
+          <w:p>
+            <w:pPr>
+              <w:spacing w:after="20" w:before="20"/>
+            </w:pPr>
+          </w:p>
+        </w:tc>
+        <w:tc>
+          <w:tcPr>
+            <w:tcW w:type="dxa" w:w="643"/>
+            <w:tcMar>
+              <w:top w:type="dxa" w:w="60"/>
+              <w:left w:type="dxa" w:w="100"/>
+              <w:bottom w:type="dxa" w:w="60"/>
+              <w:right w:type="dxa" w:w="100"/>
+            </w:tcMar>
+          </w:tcPr>
+          <w:p>
+            <w:pPr>
+              <w:spacing w:after="20" w:before="20"/>
+            </w:pPr>
+          </w:p>
+        </w:tc>
+        <w:tc>
+          <w:tcPr>
+            <w:tcW w:type="dxa" w:w="643"/>
+            <w:tcMar>
+              <w:top w:type="dxa" w:w="60"/>
+              <w:left w:type="dxa" w:w="100"/>
+              <w:bottom w:type="dxa" w:w="60"/>
+              <w:right w:type="dxa" w:w="100"/>
+            </w:tcMar>
+          </w:tcPr>
+          <w:p>
+            <w:pPr>
+              <w:spacing w:after="20" w:before="20"/>
+            </w:pPr>
+            <w:r>
+              <w:t xml:space="preserve">██</w:t>
+            </w:r>
+          </w:p>
+        </w:tc>
+        <w:tc>
+          <w:tcPr>
+            <w:tcW w:type="dxa" w:w="643"/>
+            <w:tcMar>
+              <w:top w:type="dxa" w:w="60"/>
+              <w:left w:type="dxa" w:w="100"/>
+              <w:bottom w:type="dxa" w:w="60"/>
+              <w:right w:type="dxa" w:w="100"/>
+            </w:tcMar>
+          </w:tcPr>
+          <w:p>
+            <w:pPr>
+              <w:spacing w:after="20" w:before="20"/>
+            </w:pPr>
+            <w:r>
+              <w:t xml:space="preserve">██</w:t>
+            </w:r>
+          </w:p>
+        </w:tc>
+        <w:tc>
+          <w:tcPr>
+            <w:tcW w:type="dxa" w:w="643"/>
+            <w:tcMar>
+              <w:top w:type="dxa" w:w="60"/>
+              <w:left w:type="dxa" w:w="100"/>
+              <w:bottom w:type="dxa" w:w="60"/>
+              <w:right w:type="dxa" w:w="100"/>
+            </w:tcMar>
+          </w:tcPr>
+          <w:p>
+            <w:pPr>
+              <w:spacing w:after="20" w:before="20"/>
+            </w:pPr>
+            <w:r>
+              <w:t xml:space="preserve">██</w:t>
+            </w:r>
+          </w:p>
+        </w:tc>
+        <w:tc>
+          <w:tcPr>
+            <w:tcW w:type="dxa" w:w="643"/>
+            <w:tcMar>
+              <w:top w:type="dxa" w:w="60"/>
+              <w:left w:type="dxa" w:w="100"/>
+              <w:bottom w:type="dxa" w:w="60"/>
+              <w:right w:type="dxa" w:w="100"/>
+            </w:tcMar>
+          </w:tcPr>
+          <w:p>
+            <w:pPr>
+              <w:spacing w:after="20" w:before="20"/>
+            </w:pPr>
+            <w:r>
+              <w:t xml:space="preserve">██</w:t>
+            </w:r>
+          </w:p>
+        </w:tc>
+        <w:tc>
+          <w:tcPr>
+            <w:tcW w:type="dxa" w:w="643"/>
+            <w:tcMar>
+              <w:top w:type="dxa" w:w="60"/>
+              <w:left w:type="dxa" w:w="100"/>
+              <w:bottom w:type="dxa" w:w="60"/>
+              <w:right w:type="dxa" w:w="100"/>
+            </w:tcMar>
+          </w:tcPr>
+          <w:p>
+            <w:pPr>
+              <w:spacing w:after="20" w:before="20"/>
+            </w:pPr>
+          </w:p>
+        </w:tc>
+        <w:tc>
+          <w:tcPr>
+            <w:tcW w:type="dxa" w:w="643"/>
+            <w:tcMar>
+              <w:top w:type="dxa" w:w="60"/>
+              <w:left w:type="dxa" w:w="100"/>
+              <w:bottom w:type="dxa" w:w="60"/>
+              <w:right w:type="dxa" w:w="100"/>
+            </w:tcMar>
+          </w:tcPr>
+          <w:p>
+            <w:pPr>
+              <w:spacing w:after="20" w:before="20"/>
+            </w:pPr>
+          </w:p>
+        </w:tc>
+      </w:tr>
+      <w:tr>
+        <w:trPr>
+          <w:tblHeader w:val="false"/>
+        </w:trPr>
+        <w:tc>
+          <w:tcPr>
+            <w:tcW w:type="dxa" w:w="3314"/>
+            <w:tcMar>
+              <w:top w:type="dxa" w:w="60"/>
+              <w:left w:type="dxa" w:w="100"/>
+              <w:bottom w:type="dxa" w:w="60"/>
+              <w:right w:type="dxa" w:w="100"/>
+            </w:tcMar>
+          </w:tcPr>
+          <w:p>
+            <w:pPr>
+              <w:spacing w:after="20" w:before="20"/>
+            </w:pPr>
+            <w:r>
+              <w:t xml:space="preserve">Pre-cutover checklist + deploy</w:t>
+            </w:r>
+          </w:p>
+        </w:tc>
+        <w:tc>
+          <w:tcPr>
+            <w:tcW w:type="dxa" w:w="643"/>
+            <w:tcMar>
+              <w:top w:type="dxa" w:w="60"/>
+              <w:left w:type="dxa" w:w="100"/>
+              <w:bottom w:type="dxa" w:w="60"/>
+              <w:right w:type="dxa" w:w="100"/>
+            </w:tcMar>
+          </w:tcPr>
+          <w:p>
+            <w:pPr>
+              <w:spacing w:after="20" w:before="20"/>
+            </w:pPr>
+          </w:p>
+        </w:tc>
+        <w:tc>
+          <w:tcPr>
+            <w:tcW w:type="dxa" w:w="643"/>
+            <w:tcMar>
+              <w:top w:type="dxa" w:w="60"/>
+              <w:left w:type="dxa" w:w="100"/>
+              <w:bottom w:type="dxa" w:w="60"/>
+              <w:right w:type="dxa" w:w="100"/>
+            </w:tcMar>
+          </w:tcPr>
+          <w:p>
+            <w:pPr>
+              <w:spacing w:after="20" w:before="20"/>
+            </w:pPr>
+          </w:p>
+        </w:tc>
+        <w:tc>
+          <w:tcPr>
+            <w:tcW w:type="dxa" w:w="643"/>
+            <w:tcMar>
+              <w:top w:type="dxa" w:w="60"/>
+              <w:left w:type="dxa" w:w="100"/>
+              <w:bottom w:type="dxa" w:w="60"/>
+              <w:right w:type="dxa" w:w="100"/>
+            </w:tcMar>
+          </w:tcPr>
+          <w:p>
+            <w:pPr>
+              <w:spacing w:after="20" w:before="20"/>
+            </w:pPr>
+          </w:p>
+        </w:tc>
+        <w:tc>
+          <w:tcPr>
+            <w:tcW w:type="dxa" w:w="643"/>
+            <w:tcMar>
+              <w:top w:type="dxa" w:w="60"/>
+              <w:left w:type="dxa" w:w="100"/>
+              <w:bottom w:type="dxa" w:w="60"/>
+              <w:right w:type="dxa" w:w="100"/>
+            </w:tcMar>
+          </w:tcPr>
+          <w:p>
+            <w:pPr>
+              <w:spacing w:after="20" w:before="20"/>
+            </w:pPr>
+          </w:p>
+        </w:tc>
+        <w:tc>
+          <w:tcPr>
+            <w:tcW w:type="dxa" w:w="643"/>
+            <w:tcMar>
+              <w:top w:type="dxa" w:w="60"/>
+              <w:left w:type="dxa" w:w="100"/>
+              <w:bottom w:type="dxa" w:w="60"/>
+              <w:right w:type="dxa" w:w="100"/>
+            </w:tcMar>
+          </w:tcPr>
+          <w:p>
+            <w:pPr>
+              <w:spacing w:after="20" w:before="20"/>
+            </w:pPr>
+          </w:p>
+        </w:tc>
+        <w:tc>
+          <w:tcPr>
+            <w:tcW w:type="dxa" w:w="643"/>
+            <w:tcMar>
+              <w:top w:type="dxa" w:w="60"/>
+              <w:left w:type="dxa" w:w="100"/>
+              <w:bottom w:type="dxa" w:w="60"/>
+              <w:right w:type="dxa" w:w="100"/>
+            </w:tcMar>
+          </w:tcPr>
+          <w:p>
+            <w:pPr>
+              <w:spacing w:after="20" w:before="20"/>
+            </w:pPr>
+          </w:p>
+        </w:tc>
+        <w:tc>
+          <w:tcPr>
+            <w:tcW w:type="dxa" w:w="643"/>
+            <w:tcMar>
+              <w:top w:type="dxa" w:w="60"/>
+              <w:left w:type="dxa" w:w="100"/>
+              <w:bottom w:type="dxa" w:w="60"/>
+              <w:right w:type="dxa" w:w="100"/>
+            </w:tcMar>
+          </w:tcPr>
+          <w:p>
+            <w:pPr>
+              <w:spacing w:after="20" w:before="20"/>
+            </w:pPr>
+          </w:p>
+        </w:tc>
+        <w:tc>
+          <w:tcPr>
+            <w:tcW w:type="dxa" w:w="643"/>
+            <w:tcMar>
+              <w:top w:type="dxa" w:w="60"/>
+              <w:left w:type="dxa" w:w="100"/>
+              <w:bottom w:type="dxa" w:w="60"/>
+              <w:right w:type="dxa" w:w="100"/>
+            </w:tcMar>
+          </w:tcPr>
+          <w:p>
+            <w:pPr>
+              <w:spacing w:after="20" w:before="20"/>
+            </w:pPr>
+            <w:r>
+              <w:t xml:space="preserve">██</w:t>
+            </w:r>
+          </w:p>
+        </w:tc>
+        <w:tc>
+          <w:tcPr>
+            <w:tcW w:type="dxa" w:w="643"/>
+            <w:tcMar>
+              <w:top w:type="dxa" w:w="60"/>
+              <w:left w:type="dxa" w:w="100"/>
+              <w:bottom w:type="dxa" w:w="60"/>
+              <w:right w:type="dxa" w:w="100"/>
+            </w:tcMar>
+          </w:tcPr>
+          <w:p>
+            <w:pPr>
+              <w:spacing w:after="20" w:before="20"/>
+            </w:pPr>
+            <w:r>
+              <w:t xml:space="preserve">██</w:t>
+            </w:r>
+          </w:p>
+        </w:tc>
+        <w:tc>
+          <w:tcPr>
+            <w:tcW w:type="dxa" w:w="643"/>
+            <w:tcMar>
+              <w:top w:type="dxa" w:w="60"/>
+              <w:left w:type="dxa" w:w="100"/>
+              <w:bottom w:type="dxa" w:w="60"/>
+              <w:right w:type="dxa" w:w="100"/>
+            </w:tcMar>
+          </w:tcPr>
+          <w:p>
+            <w:pPr>
+              <w:spacing w:after="20" w:before="20"/>
+            </w:pPr>
+          </w:p>
+        </w:tc>
+      </w:tr>
+      <w:tr>
+        <w:trPr>
+          <w:tblHeader w:val="false"/>
+        </w:trPr>
+        <w:tc>
+          <w:tcPr>
+            <w:tcW w:type="dxa" w:w="3314"/>
+            <w:tcMar>
+              <w:top w:type="dxa" w:w="60"/>
+              <w:left w:type="dxa" w:w="100"/>
+              <w:bottom w:type="dxa" w:w="60"/>
+              <w:right w:type="dxa" w:w="100"/>
+            </w:tcMar>
+          </w:tcPr>
+          <w:p>
+            <w:pPr>
+              <w:spacing w:after="20" w:before="20"/>
+            </w:pPr>
+            <w:r>
+              <w:t xml:space="preserve">Cutover + cancel Casinoware + post-mortem</w:t>
+            </w:r>
+          </w:p>
+        </w:tc>
+        <w:tc>
+          <w:tcPr>
+            <w:tcW w:type="dxa" w:w="643"/>
+            <w:tcMar>
+              <w:top w:type="dxa" w:w="60"/>
+              <w:left w:type="dxa" w:w="100"/>
+              <w:bottom w:type="dxa" w:w="60"/>
+              <w:right w:type="dxa" w:w="100"/>
+            </w:tcMar>
+          </w:tcPr>
+          <w:p>
+            <w:pPr>
+              <w:spacing w:after="20" w:before="20"/>
+            </w:pPr>
+          </w:p>
+        </w:tc>
+        <w:tc>
+          <w:tcPr>
+            <w:tcW w:type="dxa" w:w="643"/>
+            <w:tcMar>
+              <w:top w:type="dxa" w:w="60"/>
+              <w:left w:type="dxa" w:w="100"/>
+              <w:bottom w:type="dxa" w:w="60"/>
+              <w:right w:type="dxa" w:w="100"/>
+            </w:tcMar>
+          </w:tcPr>
+          <w:p>
+            <w:pPr>
+              <w:spacing w:after="20" w:before="20"/>
+            </w:pPr>
+          </w:p>
+        </w:tc>
+        <w:tc>
+          <w:tcPr>
+            <w:tcW w:type="dxa" w:w="643"/>
+            <w:tcMar>
+              <w:top w:type="dxa" w:w="60"/>
+              <w:left w:type="dxa" w:w="100"/>
+              <w:bottom w:type="dxa" w:w="60"/>
+              <w:right w:type="dxa" w:w="100"/>
+            </w:tcMar>
+          </w:tcPr>
+          <w:p>
+            <w:pPr>
+              <w:spacing w:after="20" w:before="20"/>
+            </w:pPr>
+          </w:p>
+        </w:tc>
+        <w:tc>
+          <w:tcPr>
+            <w:tcW w:type="dxa" w:w="643"/>
+            <w:tcMar>
+              <w:top w:type="dxa" w:w="60"/>
+              <w:left w:type="dxa" w:w="100"/>
+              <w:bottom w:type="dxa" w:w="60"/>
+              <w:right w:type="dxa" w:w="100"/>
+            </w:tcMar>
+          </w:tcPr>
+          <w:p>
+            <w:pPr>
+              <w:spacing w:after="20" w:before="20"/>
+            </w:pPr>
+          </w:p>
+        </w:tc>
+        <w:tc>
+          <w:tcPr>
+            <w:tcW w:type="dxa" w:w="643"/>
+            <w:tcMar>
+              <w:top w:type="dxa" w:w="60"/>
+              <w:left w:type="dxa" w:w="100"/>
+              <w:bottom w:type="dxa" w:w="60"/>
+              <w:right w:type="dxa" w:w="100"/>
+            </w:tcMar>
+          </w:tcPr>
+          <w:p>
+            <w:pPr>
+              <w:spacing w:after="20" w:before="20"/>
+            </w:pPr>
+          </w:p>
+        </w:tc>
+        <w:tc>
+          <w:tcPr>
+            <w:tcW w:type="dxa" w:w="643"/>
+            <w:tcMar>
+              <w:top w:type="dxa" w:w="60"/>
+              <w:left w:type="dxa" w:w="100"/>
+              <w:bottom w:type="dxa" w:w="60"/>
+              <w:right w:type="dxa" w:w="100"/>
+            </w:tcMar>
+          </w:tcPr>
+          <w:p>
+            <w:pPr>
+              <w:spacing w:after="20" w:before="20"/>
+            </w:pPr>
+          </w:p>
+        </w:tc>
+        <w:tc>
+          <w:tcPr>
+            <w:tcW w:type="dxa" w:w="643"/>
+            <w:tcMar>
+              <w:top w:type="dxa" w:w="60"/>
+              <w:left w:type="dxa" w:w="100"/>
+              <w:bottom w:type="dxa" w:w="60"/>
+              <w:right w:type="dxa" w:w="100"/>
+            </w:tcMar>
+          </w:tcPr>
+          <w:p>
+            <w:pPr>
+              <w:spacing w:after="20" w:before="20"/>
+            </w:pPr>
+          </w:p>
+        </w:tc>
+        <w:tc>
+          <w:tcPr>
+            <w:tcW w:type="dxa" w:w="643"/>
+            <w:tcMar>
+              <w:top w:type="dxa" w:w="60"/>
+              <w:left w:type="dxa" w:w="100"/>
+              <w:bottom w:type="dxa" w:w="60"/>
+              <w:right w:type="dxa" w:w="100"/>
+            </w:tcMar>
+          </w:tcPr>
+          <w:p>
+            <w:pPr>
+              <w:spacing w:after="20" w:before="20"/>
+            </w:pPr>
+          </w:p>
+        </w:tc>
+        <w:tc>
+          <w:tcPr>
+            <w:tcW w:type="dxa" w:w="643"/>
+            <w:tcMar>
+              <w:top w:type="dxa" w:w="60"/>
+              <w:left w:type="dxa" w:w="100"/>
+              <w:bottom w:type="dxa" w:w="60"/>
+              <w:right w:type="dxa" w:w="100"/>
+            </w:tcMar>
+          </w:tcPr>
+          <w:p>
+            <w:pPr>
+              <w:spacing w:after="20" w:before="20"/>
+            </w:pPr>
+            <w:r>
+              <w:t xml:space="preserve">██</w:t>
+            </w:r>
+          </w:p>
+        </w:tc>
+        <w:tc>
+          <w:tcPr>
+            <w:tcW w:type="dxa" w:w="643"/>
+            <w:tcMar>
+              <w:top w:type="dxa" w:w="60"/>
+              <w:left w:type="dxa" w:w="100"/>
+              <w:bottom w:type="dxa" w:w="60"/>
+              <w:right w:type="dxa" w:w="100"/>
+            </w:tcMar>
+          </w:tcPr>
+          <w:p>
+            <w:pPr>
+              <w:spacing w:after="20" w:before="20"/>
+            </w:pPr>
+            <w:r>
+              <w:t xml:space="preserve">██</w:t>
+            </w:r>
+          </w:p>
+        </w:tc>
+      </w:tr>
+    </w:tbl>
     <w:p>
       <w:pPr>
-        <w:spacing w:after="120"/>
-      </w:pPr>
-      <w:r>
-        <w:t xml:space="preserve">``</w:t>
-      </w:r>
-      <w:r>
-        <w:rPr>
-          <w:rFonts w:ascii="Consolas" w:cs="Consolas" w:eastAsia="Consolas" w:hAnsi="Consolas"/>
-          <w:sz w:val="19"/>
-          <w:szCs w:val="19"/>
-        </w:rPr>
-        <w:t xml:space="preserve"> Rollout activity                                   R1 R2 R3 R4 R5 R6 R7 R8 R9 R10 R1 Handbook + champion training                    ██ ██ R1 Group training                                     ██ R1 Tournaments 1–2 (parallel run)                       ██ ██ R1 Bug-fix sprint                                          ██ ██ R1 Tournaments 3–5 + reconciliation                           ██ ██ ██ ██ R2 Pre-cutover checklist + deploy                                       ██ ██ R2 Cutover + cancel Casinoware + post-mortem                               ██ ██ </w:t>
-      </w:r>
-      <w:r>
-        <w:t xml:space="preserve">``</w:t>
-      </w:r>
+        <w:spacing w:after="80"/>
+      </w:pPr>
     </w:p>
     <w:p>
       <w:pPr>

</xml_diff>